<commit_message>
initialzoterointegrationU9-10, fix to broken video
</commit_message>
<xml_diff>
--- a/docs/MCOM-221.docx
+++ b/docs/MCOM-221.docx
@@ -23,7 +23,7 @@
         <w:pStyle w:val="Date"/>
       </w:pPr>
       <w:r>
-        <w:t xml:space="preserve">Mar 6, 2026</w:t>
+        <w:t xml:space="preserve">Mar 18, 2026</w:t>
       </w:r>
     </w:p>
     <w:p>
@@ -10864,7 +10864,7 @@
           <w:rPr>
             <w:rStyle w:val="Hyperlink"/>
           </w:rPr>
-          <w:t xml:space="preserve">Killick, 2014</w:t>
+          <w:t xml:space="preserve">Killick, 2014b</w:t>
         </w:r>
       </w:hyperlink>
       <w:r>
@@ -12504,7 +12504,7 @@
       <w:pPr>
         <w:pStyle w:val="BodyText"/>
       </w:pPr>
-      <w:hyperlink r:id="rId61">
+      <w:hyperlink r:id="rId63">
         <w:r>
           <w:rPr>
             <w:rStyle w:val="Hyperlink"/>
@@ -12548,7 +12548,7 @@
       <w:pPr>
         <w:pStyle w:val="BodyText"/>
       </w:pPr>
-      <w:hyperlink r:id="rId63">
+      <w:hyperlink r:id="rId64">
         <w:r>
           <w:rPr>
             <w:rStyle w:val="Hyperlink"/>
@@ -12574,7 +12574,7 @@
       <w:r>
         <w:t xml:space="preserve"> </w:t>
       </w:r>
-      <w:hyperlink r:id="rId64">
+      <w:hyperlink r:id="rId65">
         <w:r>
           <w:rPr>
             <w:rStyle w:val="Hyperlink"/>
@@ -12607,7 +12607,7 @@
       <w:pPr>
         <w:pStyle w:val="BodyText"/>
       </w:pPr>
-      <w:hyperlink r:id="rId65">
+      <w:hyperlink r:id="rId66">
         <w:r>
           <w:rPr>
             <w:rStyle w:val="Hyperlink"/>
@@ -12806,7 +12806,7 @@
       <w:pPr>
         <w:pStyle w:val="BodyText"/>
       </w:pPr>
-      <w:hyperlink r:id="rId65">
+      <w:hyperlink r:id="rId66">
         <w:r>
           <w:rPr>
             <w:rStyle w:val="Hyperlink"/>
@@ -12945,7 +12945,7 @@
       <w:r>
         <w:t xml:space="preserve"> </w:t>
       </w:r>
-      <w:hyperlink r:id="rId66">
+      <w:hyperlink r:id="rId67">
         <w:r>
           <w:rPr>
             <w:rStyle w:val="Hyperlink"/>
@@ -12959,7 +12959,7 @@
       <w:r>
         <w:t xml:space="preserve">website gives an overview of the type of features you want to look for. For free and inexpensive Android-based video software see:</w:t>
       </w:r>
-      <w:hyperlink r:id="rId67">
+      <w:hyperlink r:id="rId68">
         <w:r>
           <w:rPr>
             <w:rStyle w:val="Hyperlink"/>
@@ -12976,7 +12976,7 @@
       <w:r>
         <w:t xml:space="preserve"> </w:t>
       </w:r>
-      <w:hyperlink r:id="rId68">
+      <w:hyperlink r:id="rId69">
         <w:r>
           <w:rPr>
             <w:rStyle w:val="Hyperlink"/>
@@ -14041,7 +14041,7 @@
       <w:r>
         <w:t xml:space="preserve"> </w:t>
       </w:r>
-      <w:hyperlink r:id="rId69">
+      <w:hyperlink r:id="rId70">
         <w:r>
           <w:rPr>
             <w:rStyle w:val="Hyperlink"/>
@@ -14076,7 +14076,7 @@
       <w:pPr>
         <w:pStyle w:val="BodyText"/>
       </w:pPr>
-      <w:hyperlink r:id="rId70">
+      <w:hyperlink r:id="rId71">
         <w:r>
           <w:rPr>
             <w:rStyle w:val="Hyperlink"/>
@@ -14511,7 +14511,7 @@
       <w:pPr>
         <w:pStyle w:val="BodyText"/>
       </w:pPr>
-      <w:hyperlink r:id="rId71">
+      <w:hyperlink r:id="rId72">
         <w:r>
           <w:rPr>
             <w:rStyle w:val="Hyperlink"/>
@@ -14536,12 +14536,29 @@
       <w:r>
         <w:t xml:space="preserve"> </w:t>
       </w:r>
-    </w:p>
-    <w:p>
-      <w:pPr>
-        <w:pStyle w:val="BodyText"/>
-      </w:pPr>
-      <w:hyperlink r:id="rId72">
+      <w:r>
+        <w:t xml:space="preserve">(</w:t>
+      </w:r>
+      <w:hyperlink w:anchor="ref-indymogul7ThingsKnow2013">
+        <w:r>
+          <w:rPr>
+            <w:rStyle w:val="Hyperlink"/>
+          </w:rPr>
+          <w:t xml:space="preserve">Mogul, 2013</w:t>
+        </w:r>
+      </w:hyperlink>
+      <w:r>
+        <w:t xml:space="preserve">)</w:t>
+      </w:r>
+      <w:r>
+        <w:t xml:space="preserve"> </w:t>
+      </w:r>
+    </w:p>
+    <w:p>
+      <w:pPr>
+        <w:pStyle w:val="BodyText"/>
+      </w:pPr>
+      <w:hyperlink r:id="rId73">
         <w:r>
           <w:rPr>
             <w:rStyle w:val="Hyperlink"/>
@@ -15093,7 +15110,7 @@
       <w:r>
         <w:t xml:space="preserve"> </w:t>
       </w:r>
-      <w:hyperlink r:id="rId73">
+      <w:hyperlink r:id="rId74">
         <w:r>
           <w:rPr>
             <w:rStyle w:val="Hyperlink"/>
@@ -15101,6 +15118,53 @@
           <w:t xml:space="preserve">What Type Of Short Films Do We Prefer?</w:t>
         </w:r>
       </w:hyperlink>
+      <w:r>
+        <w:t xml:space="preserve"> </w:t>
+      </w:r>
+      <w:r>
+        <w:t xml:space="preserve">(</w:t>
+      </w:r>
+      <w:hyperlink w:anchor="ref-adminWhatTypeShort2012">
+        <w:r>
+          <w:rPr>
+            <w:rStyle w:val="Hyperlink"/>
+          </w:rPr>
+          <w:t xml:space="preserve">“What Type of Short Films Do We Prefer on</w:t>
+        </w:r>
+        <w:r>
+          <w:rPr>
+            <w:rStyle w:val="Hyperlink"/>
+          </w:rPr>
+          <w:t xml:space="preserve"> </w:t>
+        </w:r>
+        <w:r>
+          <w:rPr>
+            <w:rStyle w:val="Hyperlink"/>
+          </w:rPr>
+          <w:t xml:space="preserve">FilmShortage</w:t>
+        </w:r>
+        <w:r>
+          <w:rPr>
+            <w:rStyle w:val="Hyperlink"/>
+          </w:rPr>
+          <w:t xml:space="preserve">?”</w:t>
+        </w:r>
+        <w:r>
+          <w:rPr>
+            <w:rStyle w:val="Hyperlink"/>
+          </w:rPr>
+          <w:t xml:space="preserve"> </w:t>
+        </w:r>
+        <w:r>
+          <w:rPr>
+            <w:rStyle w:val="Hyperlink"/>
+          </w:rPr>
+          <w:t xml:space="preserve">2012</w:t>
+        </w:r>
+      </w:hyperlink>
+      <w:r>
+        <w:t xml:space="preserve">)</w:t>
+      </w:r>
     </w:p>
     <w:p>
       <w:pPr>
@@ -15394,7 +15458,7 @@
       <w:r>
         <w:t xml:space="preserve"> </w:t>
       </w:r>
-      <w:hyperlink r:id="rId74">
+      <w:hyperlink r:id="rId75">
         <w:r>
           <w:rPr>
             <w:rStyle w:val="Hyperlink"/>
@@ -15402,6 +15466,23 @@
           <w:t xml:space="preserve">Popular Short film genres.</w:t>
         </w:r>
       </w:hyperlink>
+      <w:r>
+        <w:t xml:space="preserve"> </w:t>
+      </w:r>
+      <w:r>
+        <w:t xml:space="preserve">(</w:t>
+      </w:r>
+      <w:hyperlink w:anchor="ref-PopularShortFilm">
+        <w:r>
+          <w:rPr>
+            <w:rStyle w:val="Hyperlink"/>
+          </w:rPr>
+          <w:t xml:space="preserve">Barnes, n.d.</w:t>
+        </w:r>
+      </w:hyperlink>
+      <w:r>
+        <w:t xml:space="preserve">)</w:t>
+      </w:r>
     </w:p>
     <w:p>
       <w:pPr>
@@ -15423,7 +15504,7 @@
       <w:pPr>
         <w:pStyle w:val="BodyText"/>
       </w:pPr>
-      <w:hyperlink r:id="rId75">
+      <w:hyperlink r:id="rId76">
         <w:r>
           <w:rPr>
             <w:rStyle w:val="Hyperlink"/>
@@ -15431,6 +15512,23 @@
           <w:t xml:space="preserve">What Is Genre and How Is It Determined?</w:t>
         </w:r>
       </w:hyperlink>
+      <w:r>
+        <w:t xml:space="preserve"> </w:t>
+      </w:r>
+      <w:r>
+        <w:t xml:space="preserve">(</w:t>
+      </w:r>
+      <w:hyperlink w:anchor="ref-reich2WhatGenre2017">
+        <w:r>
+          <w:rPr>
+            <w:rStyle w:val="Hyperlink"/>
+          </w:rPr>
+          <w:t xml:space="preserve">Reich, 2017</w:t>
+        </w:r>
+      </w:hyperlink>
+      <w:r>
+        <w:t xml:space="preserve">)</w:t>
+      </w:r>
     </w:p>
     <w:p>
       <w:pPr>
@@ -15568,7 +15666,7 @@
       <w:pPr>
         <w:pStyle w:val="BodyText"/>
       </w:pPr>
-      <w:hyperlink r:id="rId76">
+      <w:hyperlink r:id="rId77">
         <w:r>
           <w:rPr>
             <w:rStyle w:val="Hyperlink"/>
@@ -15593,12 +15691,29 @@
       <w:r>
         <w:t xml:space="preserve"> </w:t>
       </w:r>
-    </w:p>
-    <w:p>
-      <w:pPr>
-        <w:pStyle w:val="BodyText"/>
-      </w:pPr>
-      <w:hyperlink r:id="rId77">
+      <w:r>
+        <w:t xml:space="preserve">(</w:t>
+      </w:r>
+      <w:hyperlink w:anchor="ref-tylermoweryHowWriteShort2019">
+        <w:r>
+          <w:rPr>
+            <w:rStyle w:val="Hyperlink"/>
+          </w:rPr>
+          <w:t xml:space="preserve">Mowery, 2019</w:t>
+        </w:r>
+      </w:hyperlink>
+      <w:r>
+        <w:t xml:space="preserve">)</w:t>
+      </w:r>
+      <w:r>
+        <w:t xml:space="preserve"> </w:t>
+      </w:r>
+    </w:p>
+    <w:p>
+      <w:pPr>
+        <w:pStyle w:val="BodyText"/>
+      </w:pPr>
+      <w:hyperlink r:id="rId78">
         <w:r>
           <w:rPr>
             <w:rStyle w:val="Hyperlink"/>
@@ -15851,7 +15966,7 @@
       <w:r>
         <w:t xml:space="preserve"> </w:t>
       </w:r>
-      <w:hyperlink r:id="rId78">
+      <w:hyperlink r:id="rId79">
         <w:r>
           <w:rPr>
             <w:rStyle w:val="Hyperlink"/>
@@ -16480,7 +16595,7 @@
       <w:r>
         <w:t xml:space="preserve"> </w:t>
       </w:r>
-      <w:hyperlink r:id="rId79">
+      <w:hyperlink r:id="rId80">
         <w:r>
           <w:rPr>
             <w:rStyle w:val="Hyperlink"/>
@@ -16492,7 +16607,27 @@
         <w:t xml:space="preserve"> </w:t>
       </w:r>
       <w:r>
-        <w:t xml:space="preserve">by Ken Miyamoto.</w:t>
+        <w:t xml:space="preserve">by Ken Miyamoto</w:t>
+      </w:r>
+      <w:r>
+        <w:t xml:space="preserve"> </w:t>
+      </w:r>
+      <w:r>
+        <w:t xml:space="preserve">(</w:t>
+      </w:r>
+      <w:hyperlink w:anchor="ref-OutlinesTreatmentsScriptments">
+        <w:r>
+          <w:rPr>
+            <w:rStyle w:val="Hyperlink"/>
+          </w:rPr>
+          <w:t xml:space="preserve">n.d.</w:t>
+        </w:r>
+      </w:hyperlink>
+      <w:r>
+        <w:t xml:space="preserve">)</w:t>
+      </w:r>
+      <w:r>
+        <w:t xml:space="preserve">.</w:t>
       </w:r>
     </w:p>
     <w:p>
@@ -17670,7 +17805,7 @@
       <w:pPr>
         <w:pStyle w:val="BodyText"/>
       </w:pPr>
-      <w:hyperlink r:id="rId80">
+      <w:hyperlink r:id="rId81">
         <w:r>
           <w:rPr>
             <w:rStyle w:val="Hyperlink"/>
@@ -17695,12 +17830,29 @@
       <w:r>
         <w:t xml:space="preserve"> </w:t>
       </w:r>
-    </w:p>
-    <w:p>
-      <w:pPr>
-        <w:pStyle w:val="BodyText"/>
-      </w:pPr>
-      <w:hyperlink r:id="rId81">
+      <w:r>
+        <w:t xml:space="preserve">(</w:t>
+      </w:r>
+      <w:hyperlink w:anchor="ref-Filmriot2011">
+        <w:r>
+          <w:rPr>
+            <w:rStyle w:val="Hyperlink"/>
+          </w:rPr>
+          <w:t xml:space="preserve">Film Riot, 2011</w:t>
+        </w:r>
+      </w:hyperlink>
+      <w:r>
+        <w:t xml:space="preserve">)</w:t>
+      </w:r>
+      <w:r>
+        <w:t xml:space="preserve"> </w:t>
+      </w:r>
+    </w:p>
+    <w:p>
+      <w:pPr>
+        <w:pStyle w:val="BodyText"/>
+      </w:pPr>
+      <w:hyperlink r:id="rId82">
         <w:r>
           <w:rPr>
             <w:rStyle w:val="Hyperlink"/>
@@ -17713,7 +17865,7 @@
       <w:pPr>
         <w:pStyle w:val="BodyText"/>
       </w:pPr>
-      <w:hyperlink r:id="rId82">
+      <w:hyperlink r:id="rId83">
         <w:r>
           <w:rPr>
             <w:rStyle w:val="Hyperlink"/>
@@ -17738,12 +17890,29 @@
       <w:r>
         <w:t xml:space="preserve"> </w:t>
       </w:r>
-    </w:p>
-    <w:p>
-      <w:pPr>
-        <w:pStyle w:val="BodyText"/>
-      </w:pPr>
-      <w:hyperlink r:id="rId83">
+      <w:r>
+        <w:t xml:space="preserve">(</w:t>
+      </w:r>
+      <w:hyperlink w:anchor="ref-Studiobinder2018">
+        <w:r>
+          <w:rPr>
+            <w:rStyle w:val="Hyperlink"/>
+          </w:rPr>
+          <w:t xml:space="preserve">StudioBinder, 2018</w:t>
+        </w:r>
+      </w:hyperlink>
+      <w:r>
+        <w:t xml:space="preserve">)</w:t>
+      </w:r>
+      <w:r>
+        <w:t xml:space="preserve"> </w:t>
+      </w:r>
+    </w:p>
+    <w:p>
+      <w:pPr>
+        <w:pStyle w:val="BodyText"/>
+      </w:pPr>
+      <w:hyperlink r:id="rId84">
         <w:r>
           <w:rPr>
             <w:rStyle w:val="Hyperlink"/>
@@ -17924,7 +18093,7 @@
       <w:r>
         <w:t xml:space="preserve"> </w:t>
       </w:r>
-      <w:hyperlink r:id="rId84">
+      <w:hyperlink r:id="rId85">
         <w:r>
           <w:rPr>
             <w:rStyle w:val="Hyperlink"/>
@@ -17937,12 +18106,29 @@
       <w:r>
         <w:t xml:space="preserve"> </w:t>
       </w:r>
-    </w:p>
-    <w:p>
-      <w:pPr>
-        <w:pStyle w:val="BodyText"/>
-      </w:pPr>
-      <w:hyperlink r:id="rId85">
+      <w:r>
+        <w:t xml:space="preserve">(</w:t>
+      </w:r>
+      <w:hyperlink w:anchor="ref-Thefilmmakersblog2019">
+        <w:r>
+          <w:rPr>
+            <w:rStyle w:val="Hyperlink"/>
+          </w:rPr>
+          <w:t xml:space="preserve">The Filmmaker’s Blog, 2019</w:t>
+        </w:r>
+      </w:hyperlink>
+      <w:r>
+        <w:t xml:space="preserve">)</w:t>
+      </w:r>
+      <w:r>
+        <w:t xml:space="preserve"> </w:t>
+      </w:r>
+    </w:p>
+    <w:p>
+      <w:pPr>
+        <w:pStyle w:val="BodyText"/>
+      </w:pPr>
+      <w:hyperlink r:id="rId86">
         <w:r>
           <w:rPr>
             <w:rStyle w:val="Hyperlink"/>
@@ -18155,7 +18341,7 @@
           <w:numId w:val="1100"/>
         </w:numPr>
       </w:pPr>
-      <w:hyperlink r:id="rId86">
+      <w:hyperlink r:id="rId87">
         <w:r>
           <w:rPr>
             <w:rStyle w:val="Hyperlink"/>
@@ -18180,12 +18366,29 @@
       <w:r>
         <w:t xml:space="preserve"> </w:t>
       </w:r>
+      <w:r>
+        <w:t xml:space="preserve">(</w:t>
+      </w:r>
+      <w:hyperlink w:anchor="ref-BTEC2014">
+        <w:r>
+          <w:rPr>
+            <w:rStyle w:val="Hyperlink"/>
+          </w:rPr>
+          <w:t xml:space="preserve">BTEC, 2014</w:t>
+        </w:r>
+      </w:hyperlink>
+      <w:r>
+        <w:t xml:space="preserve">)</w:t>
+      </w:r>
+      <w:r>
+        <w:t xml:space="preserve"> </w:t>
+      </w:r>
     </w:p>
     <w:p>
       <w:pPr>
         <w:pStyle w:val="FirstParagraph"/>
       </w:pPr>
-      <w:hyperlink r:id="rId87">
+      <w:hyperlink r:id="rId88">
         <w:r>
           <w:rPr>
             <w:rStyle w:val="Hyperlink"/>
@@ -18202,7 +18405,7 @@
           <w:numId w:val="1101"/>
         </w:numPr>
       </w:pPr>
-      <w:hyperlink r:id="rId88">
+      <w:hyperlink r:id="rId89">
         <w:r>
           <w:rPr>
             <w:rStyle w:val="Hyperlink"/>
@@ -18227,12 +18430,29 @@
       <w:r>
         <w:t xml:space="preserve"> </w:t>
       </w:r>
+      <w:r>
+        <w:t xml:space="preserve">(</w:t>
+      </w:r>
+      <w:hyperlink w:anchor="ref-TindellMatchcuts2016">
+        <w:r>
+          <w:rPr>
+            <w:rStyle w:val="Hyperlink"/>
+          </w:rPr>
+          <w:t xml:space="preserve">Tindell, 2016</w:t>
+        </w:r>
+      </w:hyperlink>
+      <w:r>
+        <w:t xml:space="preserve">)</w:t>
+      </w:r>
+      <w:r>
+        <w:t xml:space="preserve"> </w:t>
+      </w:r>
     </w:p>
     <w:p>
       <w:pPr>
         <w:pStyle w:val="FirstParagraph"/>
       </w:pPr>
-      <w:hyperlink r:id="rId89">
+      <w:hyperlink r:id="rId90">
         <w:r>
           <w:rPr>
             <w:rStyle w:val="Hyperlink"/>
@@ -18274,6 +18494,23 @@
       <w:r>
         <w:t xml:space="preserve"> </w:t>
       </w:r>
+      <w:r>
+        <w:t xml:space="preserve">(</w:t>
+      </w:r>
+      <w:hyperlink w:anchor="ref-Gvfstudio2013">
+        <w:r>
+          <w:rPr>
+            <w:rStyle w:val="Hyperlink"/>
+          </w:rPr>
+          <w:t xml:space="preserve">Gvfstudio, 2013</w:t>
+        </w:r>
+      </w:hyperlink>
+      <w:r>
+        <w:t xml:space="preserve">)</w:t>
+      </w:r>
+      <w:r>
+        <w:t xml:space="preserve"> </w:t>
+      </w:r>
     </w:p>
     <w:p>
       <w:pPr>
@@ -18296,7 +18533,7 @@
           <w:numId w:val="1103"/>
         </w:numPr>
       </w:pPr>
-      <w:hyperlink r:id="rId90">
+      <w:hyperlink r:id="rId91">
         <w:r>
           <w:rPr>
             <w:rStyle w:val="Hyperlink"/>
@@ -18321,12 +18558,29 @@
       <w:r>
         <w:t xml:space="preserve"> </w:t>
       </w:r>
+      <w:r>
+        <w:t xml:space="preserve">(</w:t>
+      </w:r>
+      <w:hyperlink w:anchor="ref-Killick2014">
+        <w:r>
+          <w:rPr>
+            <w:rStyle w:val="Hyperlink"/>
+          </w:rPr>
+          <w:t xml:space="preserve">Killick, 2014a</w:t>
+        </w:r>
+      </w:hyperlink>
+      <w:r>
+        <w:t xml:space="preserve">)</w:t>
+      </w:r>
+      <w:r>
+        <w:t xml:space="preserve"> </w:t>
+      </w:r>
     </w:p>
     <w:p>
       <w:pPr>
         <w:pStyle w:val="FirstParagraph"/>
       </w:pPr>
-      <w:hyperlink r:id="rId91">
+      <w:hyperlink r:id="rId92">
         <w:r>
           <w:rPr>
             <w:rStyle w:val="Hyperlink"/>
@@ -18343,7 +18597,7 @@
           <w:numId w:val="1104"/>
         </w:numPr>
       </w:pPr>
-      <w:hyperlink r:id="rId92">
+      <w:hyperlink r:id="rId93">
         <w:r>
           <w:rPr>
             <w:rStyle w:val="Hyperlink"/>
@@ -18368,12 +18622,29 @@
       <w:r>
         <w:t xml:space="preserve"> </w:t>
       </w:r>
+      <w:r>
+        <w:t xml:space="preserve">(</w:t>
+      </w:r>
+      <w:hyperlink w:anchor="ref-Videomaker2013">
+        <w:r>
+          <w:rPr>
+            <w:rStyle w:val="Hyperlink"/>
+          </w:rPr>
+          <w:t xml:space="preserve">Videomaker, 2013</w:t>
+        </w:r>
+      </w:hyperlink>
+      <w:r>
+        <w:t xml:space="preserve">)</w:t>
+      </w:r>
+      <w:r>
+        <w:t xml:space="preserve"> </w:t>
+      </w:r>
     </w:p>
     <w:p>
       <w:pPr>
         <w:pStyle w:val="FirstParagraph"/>
       </w:pPr>
-      <w:hyperlink r:id="rId93">
+      <w:hyperlink r:id="rId94">
         <w:r>
           <w:rPr>
             <w:rStyle w:val="Hyperlink"/>
@@ -18390,7 +18661,7 @@
           <w:numId w:val="1105"/>
         </w:numPr>
       </w:pPr>
-      <w:hyperlink r:id="rId94">
+      <w:hyperlink r:id="rId95">
         <w:r>
           <w:rPr>
             <w:rStyle w:val="Hyperlink"/>
@@ -18416,9 +18687,26 @@
         <w:t xml:space="preserve"> </w:t>
       </w:r>
       <w:r>
-        <w:t xml:space="preserve"> </w:t>
-      </w:r>
-      <w:hyperlink r:id="rId95">
+        <w:t xml:space="preserve">(</w:t>
+      </w:r>
+      <w:hyperlink w:anchor="ref-kaicreative30DegreeRule2017">
+        <w:r>
+          <w:rPr>
+            <w:rStyle w:val="Hyperlink"/>
+          </w:rPr>
+          <w:t xml:space="preserve">KaiCreative, 2017</w:t>
+        </w:r>
+      </w:hyperlink>
+      <w:r>
+        <w:t xml:space="preserve">)</w:t>
+      </w:r>
+      <w:r>
+        <w:t xml:space="preserve"> </w:t>
+      </w:r>
+      <w:r>
+        <w:t xml:space="preserve"> </w:t>
+      </w:r>
+      <w:hyperlink r:id="rId96">
         <w:r>
           <w:rPr>
             <w:rStyle w:val="Hyperlink"/>
@@ -18702,18 +18990,18 @@
           <wp:inline>
             <wp:extent cx="1585812" cy="1291669"/>
             <wp:effectExtent b="0" l="0" r="0" t="0"/>
-            <wp:docPr descr="A graphic stick figure pushing" title="" id="97" name="Picture"/>
+            <wp:docPr descr="A graphic stick figure pushing" title="" id="98" name="Picture"/>
             <a:graphic>
               <a:graphicData uri="http://schemas.openxmlformats.org/drawingml/2006/picture">
                 <pic:pic>
                   <pic:nvPicPr>
-                    <pic:cNvPr descr="assets/u9/Picture1.png" id="98" name="Picture"/>
+                    <pic:cNvPr descr="assets/u9/Picture1.png" id="99" name="Picture"/>
                     <pic:cNvPicPr>
                       <a:picLocks noChangeArrowheads="1" noChangeAspect="1"/>
                     </pic:cNvPicPr>
                   </pic:nvPicPr>
                   <pic:blipFill>
-                    <a:blip r:embed="rId96"/>
+                    <a:blip r:embed="rId97"/>
                     <a:stretch>
                       <a:fillRect/>
                     </a:stretch>
@@ -18892,7 +19180,7 @@
       <w:r>
         <w:t xml:space="preserve"> </w:t>
       </w:r>
-      <w:hyperlink r:id="rId99">
+      <w:hyperlink r:id="rId100">
         <w:r>
           <w:rPr>
             <w:rStyle w:val="Hyperlink"/>
@@ -18905,12 +19193,29 @@
       <w:r>
         <w:t xml:space="preserve"> </w:t>
       </w:r>
+      <w:r>
+        <w:t xml:space="preserve">(</w:t>
+      </w:r>
+      <w:hyperlink w:anchor="ref-jaredishamMasterArtShot2017">
+        <w:r>
+          <w:rPr>
+            <w:rStyle w:val="Hyperlink"/>
+          </w:rPr>
+          <w:t xml:space="preserve">Isham, 2017</w:t>
+        </w:r>
+      </w:hyperlink>
+      <w:r>
+        <w:t xml:space="preserve">)</w:t>
+      </w:r>
+      <w:r>
+        <w:t xml:space="preserve"> </w:t>
+      </w:r>
     </w:p>
     <w:p>
       <w:pPr>
         <w:pStyle w:val="FirstParagraph"/>
       </w:pPr>
-      <w:hyperlink r:id="rId100">
+      <w:hyperlink r:id="rId101">
         <w:r>
           <w:rPr>
             <w:rStyle w:val="Hyperlink"/>
@@ -19033,7 +19338,7 @@
       <w:r>
         <w:t xml:space="preserve"> </w:t>
       </w:r>
-      <w:hyperlink r:id="rId101">
+      <w:hyperlink r:id="rId102">
         <w:r>
           <w:rPr>
             <w:rStyle w:val="Hyperlink"/>
@@ -19045,6 +19350,23 @@
         <w:t xml:space="preserve"> </w:t>
       </w:r>
       <w:r>
+        <w:t xml:space="preserve">(</w:t>
+      </w:r>
+      <w:hyperlink w:anchor="ref-thefilmlookHowCastACTOR2018">
+        <w:r>
+          <w:rPr>
+            <w:rStyle w:val="Hyperlink"/>
+          </w:rPr>
+          <w:t xml:space="preserve">The Film Look, 2018</w:t>
+        </w:r>
+      </w:hyperlink>
+      <w:r>
+        <w:t xml:space="preserve">)</w:t>
+      </w:r>
+      <w:r>
+        <w:t xml:space="preserve"> </w:t>
+      </w:r>
+      <w:r>
         <w:t xml:space="preserve">for a simple overview of a casting process</w:t>
       </w:r>
     </w:p>
@@ -19052,7 +19374,7 @@
       <w:pPr>
         <w:pStyle w:val="BodyText"/>
       </w:pPr>
-      <w:hyperlink r:id="rId102">
+      <w:hyperlink r:id="rId103">
         <w:r>
           <w:rPr>
             <w:rStyle w:val="Hyperlink"/>
@@ -19071,7 +19393,7 @@
       <w:r>
         <w:t xml:space="preserve"> </w:t>
       </w:r>
-      <w:hyperlink r:id="rId103">
+      <w:hyperlink r:id="rId104">
         <w:r>
           <w:rPr>
             <w:rStyle w:val="Hyperlink"/>
@@ -19084,12 +19406,29 @@
       <w:r>
         <w:t xml:space="preserve"> </w:t>
       </w:r>
-    </w:p>
-    <w:p>
-      <w:pPr>
-        <w:pStyle w:val="BodyText"/>
-      </w:pPr>
-      <w:hyperlink r:id="rId104">
+      <w:r>
+        <w:t xml:space="preserve">(</w:t>
+      </w:r>
+      <w:hyperlink w:anchor="X3fa1cf828e5794034f6ff7b145b6e1e1404142a">
+        <w:r>
+          <w:rPr>
+            <w:rStyle w:val="Hyperlink"/>
+          </w:rPr>
+          <w:t xml:space="preserve">The Frugal Filmmaker, 2013</w:t>
+        </w:r>
+      </w:hyperlink>
+      <w:r>
+        <w:t xml:space="preserve">)</w:t>
+      </w:r>
+      <w:r>
+        <w:t xml:space="preserve"> </w:t>
+      </w:r>
+    </w:p>
+    <w:p>
+      <w:pPr>
+        <w:pStyle w:val="BodyText"/>
+      </w:pPr>
+      <w:hyperlink r:id="rId105">
         <w:r>
           <w:rPr>
             <w:rStyle w:val="Hyperlink"/>
@@ -19110,7 +19449,7 @@
       <w:pPr>
         <w:pStyle w:val="BodyText"/>
       </w:pPr>
-      <w:hyperlink r:id="rId105">
+      <w:hyperlink r:id="rId106">
         <w:r>
           <w:rPr>
             <w:rStyle w:val="Hyperlink"/>
@@ -19135,12 +19474,29 @@
       <w:r>
         <w:t xml:space="preserve"> </w:t>
       </w:r>
-    </w:p>
-    <w:p>
-      <w:pPr>
-        <w:pStyle w:val="BodyText"/>
-      </w:pPr>
-      <w:hyperlink r:id="rId106">
+      <w:r>
+        <w:t xml:space="preserve">(</w:t>
+      </w:r>
+      <w:hyperlink w:anchor="ref-thefilmlookHowCastACTOR2018">
+        <w:r>
+          <w:rPr>
+            <w:rStyle w:val="Hyperlink"/>
+          </w:rPr>
+          <w:t xml:space="preserve">The Film Look, 2018</w:t>
+        </w:r>
+      </w:hyperlink>
+      <w:r>
+        <w:t xml:space="preserve">)</w:t>
+      </w:r>
+      <w:r>
+        <w:t xml:space="preserve"> </w:t>
+      </w:r>
+    </w:p>
+    <w:p>
+      <w:pPr>
+        <w:pStyle w:val="BodyText"/>
+      </w:pPr>
+      <w:hyperlink r:id="rId107">
         <w:r>
           <w:rPr>
             <w:rStyle w:val="Hyperlink"/>
@@ -19471,7 +19827,7 @@
       <w:pPr>
         <w:pStyle w:val="BodyText"/>
       </w:pPr>
-      <w:hyperlink r:id="rId107">
+      <w:hyperlink r:id="rId108">
         <w:r>
           <w:rPr>
             <w:rStyle w:val="Hyperlink"/>
@@ -19496,7 +19852,26 @@
       <w:r>
         <w:t xml:space="preserve"> </w:t>
       </w:r>
-      <w:hyperlink r:id="rId108">
+      <w:r>
+        <w:t xml:space="preserve">(</w:t>
+      </w:r>
+      <w:hyperlink w:anchor="ref-fandorSFXSecretsCut2018">
+        <w:r>
+          <w:rPr>
+            <w:rStyle w:val="Hyperlink"/>
+          </w:rPr>
+          <w:t xml:space="preserve">Fandor, 2018</w:t>
+        </w:r>
+      </w:hyperlink>
+      <w:r>
+        <w:t xml:space="preserve">)</w:t>
+      </w:r>
+    </w:p>
+    <w:p>
+      <w:pPr>
+        <w:pStyle w:val="BodyText"/>
+      </w:pPr>
+      <w:hyperlink r:id="rId109">
         <w:r>
           <w:rPr>
             <w:rStyle w:val="Hyperlink"/>
@@ -19509,7 +19884,7 @@
       <w:pPr>
         <w:pStyle w:val="BodyText"/>
       </w:pPr>
-      <w:hyperlink r:id="rId109">
+      <w:hyperlink r:id="rId110">
         <w:r>
           <w:rPr>
             <w:rStyle w:val="Hyperlink"/>
@@ -19531,12 +19906,29 @@
           <w:t xml:space="preserve">Video Editing Tips: J Cut vs L Cut</w:t>
         </w:r>
       </w:hyperlink>
-    </w:p>
-    <w:p>
-      <w:pPr>
-        <w:pStyle w:val="BodyText"/>
-      </w:pPr>
-      <w:hyperlink r:id="rId110">
+      <w:r>
+        <w:t xml:space="preserve"> </w:t>
+      </w:r>
+      <w:r>
+        <w:t xml:space="preserve">(</w:t>
+      </w:r>
+      <w:hyperlink w:anchor="ref-kylerhollandVideoEditingTips2018">
+        <w:r>
+          <w:rPr>
+            <w:rStyle w:val="Hyperlink"/>
+          </w:rPr>
+          <w:t xml:space="preserve">Holland, 2018</w:t>
+        </w:r>
+      </w:hyperlink>
+      <w:r>
+        <w:t xml:space="preserve">)</w:t>
+      </w:r>
+    </w:p>
+    <w:p>
+      <w:pPr>
+        <w:pStyle w:val="BodyText"/>
+      </w:pPr>
+      <w:hyperlink r:id="rId111">
         <w:r>
           <w:rPr>
             <w:rStyle w:val="Hyperlink"/>
@@ -20822,7 +21214,7 @@
           <w:numId w:val="1115"/>
         </w:numPr>
       </w:pPr>
-      <w:hyperlink r:id="rId111">
+      <w:hyperlink r:id="rId112">
         <w:r>
           <w:rPr>
             <w:rStyle w:val="Hyperlink"/>
@@ -20844,12 +21236,29 @@
           <w:t xml:space="preserve">8 ESSENTIAL skills you need for a Career in filmmaking</w:t>
         </w:r>
       </w:hyperlink>
+      <w:r>
+        <w:t xml:space="preserve"> </w:t>
+      </w:r>
+      <w:r>
+        <w:t xml:space="preserve">(</w:t>
+      </w:r>
+      <w:hyperlink w:anchor="ref-D4Darious">
+        <w:r>
+          <w:rPr>
+            <w:rStyle w:val="Hyperlink"/>
+          </w:rPr>
+          <w:t xml:space="preserve">D4Darious, 2017</w:t>
+        </w:r>
+      </w:hyperlink>
+      <w:r>
+        <w:t xml:space="preserve">)</w:t>
+      </w:r>
     </w:p>
     <w:p>
       <w:pPr>
         <w:pStyle w:val="FirstParagraph"/>
       </w:pPr>
-      <w:hyperlink r:id="rId112">
+      <w:hyperlink r:id="rId113">
         <w:r>
           <w:rPr>
             <w:rStyle w:val="Hyperlink"/>
@@ -20866,7 +21275,7 @@
           <w:numId w:val="1116"/>
         </w:numPr>
       </w:pPr>
-      <w:hyperlink r:id="rId113">
+      <w:hyperlink r:id="rId114">
         <w:r>
           <w:rPr>
             <w:rStyle w:val="Hyperlink"/>
@@ -20888,12 +21297,29 @@
           <w:t xml:space="preserve">20+ FILM SET JOBS FOR YOU</w:t>
         </w:r>
       </w:hyperlink>
+      <w:r>
+        <w:t xml:space="preserve"> </w:t>
+      </w:r>
+      <w:r>
+        <w:t xml:space="preserve">(</w:t>
+      </w:r>
+      <w:hyperlink w:anchor="ref-Haapoja2018">
+        <w:r>
+          <w:rPr>
+            <w:rStyle w:val="Hyperlink"/>
+          </w:rPr>
+          <w:t xml:space="preserve">Haapoja, 2018</w:t>
+        </w:r>
+      </w:hyperlink>
+      <w:r>
+        <w:t xml:space="preserve">)</w:t>
+      </w:r>
     </w:p>
     <w:p>
       <w:pPr>
         <w:pStyle w:val="FirstParagraph"/>
       </w:pPr>
-      <w:hyperlink r:id="rId114">
+      <w:hyperlink r:id="rId115">
         <w:r>
           <w:rPr>
             <w:rStyle w:val="Hyperlink"/>
@@ -21080,14 +21506,14 @@
         <w:t xml:space="preserve">References</w:t>
       </w:r>
     </w:p>
-    <w:bookmarkStart w:id="146" w:name="refs"/>
-    <w:bookmarkStart w:id="115" w:name="ref-FILMTERMGLOSSARY"/>
+    <w:bookmarkStart w:id="168" w:name="refs"/>
+    <w:bookmarkStart w:id="116" w:name="ref-PopularShortFilm"/>
     <w:p>
       <w:pPr>
         <w:pStyle w:val="Bibliography"/>
       </w:pPr>
       <w:r>
-        <w:t xml:space="preserve">Brooklyn College Film Department. (n.d.).</w:t>
+        <w:t xml:space="preserve">Barnes, C. (n.d.). Popular short film genres. In</w:t>
       </w:r>
       <w:r>
         <w:t xml:space="preserve"> </w:t>
@@ -21097,20 +21523,20 @@
           <w:i/>
           <w:iCs/>
         </w:rPr>
-        <w:t xml:space="preserve">Film term glossary</w:t>
-      </w:r>
-      <w:r>
-        <w:t xml:space="preserve">. https://userhome.brooklyn.cuny.edu/anthro/jbeatty/COURSES/glossary.htm.</w:t>
-      </w:r>
-    </w:p>
-    <w:bookmarkEnd w:id="115"/>
-    <w:bookmarkStart w:id="116" w:name="ref-Carroll28CompositionTechniques2023"/>
+        <w:t xml:space="preserve">Slideshare</w:t>
+      </w:r>
+      <w:r>
+        <w:t xml:space="preserve">. https://www.slideshare.net/slideshow/popular-short-film-genres/26675247.</w:t>
+      </w:r>
+    </w:p>
+    <w:bookmarkEnd w:id="116"/>
+    <w:bookmarkStart w:id="117" w:name="ref-FILMTERMGLOSSARY"/>
     <w:p>
       <w:pPr>
         <w:pStyle w:val="Bibliography"/>
       </w:pPr>
       <w:r>
-        <w:t xml:space="preserve">Carroll, B. O. (2023). 28 composition techniques that will improve your photos. In</w:t>
+        <w:t xml:space="preserve">Brooklyn College Film Department. (n.d.).</w:t>
       </w:r>
       <w:r>
         <w:t xml:space="preserve"> </w:t>
@@ -21120,20 +21546,20 @@
           <w:i/>
           <w:iCs/>
         </w:rPr>
-        <w:t xml:space="preserve">PetaPixel</w:t>
-      </w:r>
-      <w:r>
-        <w:t xml:space="preserve">.</w:t>
-      </w:r>
-    </w:p>
-    <w:bookmarkEnd w:id="116"/>
-    <w:bookmarkStart w:id="117" w:name="ref-cinefix5BrilliantMoments2017"/>
+        <w:t xml:space="preserve">Film term glossary</w:t>
+      </w:r>
+      <w:r>
+        <w:t xml:space="preserve">. https://userhome.brooklyn.cuny.edu/anthro/jbeatty/COURSES/glossary.htm.</w:t>
+      </w:r>
+    </w:p>
+    <w:bookmarkEnd w:id="117"/>
+    <w:bookmarkStart w:id="118" w:name="ref-BTEC2014"/>
     <w:p>
       <w:pPr>
         <w:pStyle w:val="Bibliography"/>
       </w:pPr>
       <w:r>
-        <w:t xml:space="preserve">CineFix. (2017).</w:t>
+        <w:t xml:space="preserve">BTEC. (2014).</w:t>
       </w:r>
       <w:r>
         <w:t xml:space="preserve"> </w:t>
@@ -21143,7 +21569,7 @@
           <w:i/>
           <w:iCs/>
         </w:rPr>
-        <w:t xml:space="preserve">5 brilliant moments of camera movement</w:t>
+        <w:t xml:space="preserve">Match on action technique</w:t>
       </w:r>
       <w:r>
         <w:t xml:space="preserve"> </w:t>
@@ -21152,14 +21578,14 @@
         <w:t xml:space="preserve">[Video]. YouTube.</w:t>
       </w:r>
     </w:p>
-    <w:bookmarkEnd w:id="117"/>
-    <w:bookmarkStart w:id="118" w:name="X660ccfd3ee355b37f2e4b9d9bd588d670e5fb1a"/>
+    <w:bookmarkEnd w:id="118"/>
+    <w:bookmarkStart w:id="119" w:name="ref-Carroll28CompositionTechniques2023"/>
     <w:p>
       <w:pPr>
         <w:pStyle w:val="Bibliography"/>
       </w:pPr>
       <w:r>
-        <w:t xml:space="preserve">CrashCourse. (2017).</w:t>
+        <w:t xml:space="preserve">Carroll, B. O. (2023). 28 composition techniques that will improve your photos. In</w:t>
       </w:r>
       <w:r>
         <w:t xml:space="preserve"> </w:t>
@@ -21169,13 +21595,48 @@
           <w:i/>
           <w:iCs/>
         </w:rPr>
-        <w:t xml:space="preserve">Pitching and pre-production:</w:t>
+        <w:t xml:space="preserve">PetaPixel</w:t>
+      </w:r>
+      <w:r>
+        <w:t xml:space="preserve">.</w:t>
+      </w:r>
+    </w:p>
+    <w:bookmarkEnd w:id="119"/>
+    <w:bookmarkStart w:id="120" w:name="ref-cinefix5BrilliantMoments2017"/>
+    <w:p>
+      <w:pPr>
+        <w:pStyle w:val="Bibliography"/>
+      </w:pPr>
+      <w:r>
+        <w:t xml:space="preserve">CineFix. (2017).</w:t>
+      </w:r>
+      <w:r>
+        <w:t xml:space="preserve"> </w:t>
       </w:r>
       <w:r>
         <w:rPr>
           <w:i/>
           <w:iCs/>
         </w:rPr>
+        <w:t xml:space="preserve">5 brilliant moments of camera movement</w:t>
+      </w:r>
+      <w:r>
+        <w:t xml:space="preserve"> </w:t>
+      </w:r>
+      <w:r>
+        <w:t xml:space="preserve">[Video]. YouTube.</w:t>
+      </w:r>
+    </w:p>
+    <w:bookmarkEnd w:id="120"/>
+    <w:bookmarkStart w:id="121" w:name="X660ccfd3ee355b37f2e4b9d9bd588d670e5fb1a"/>
+    <w:p>
+      <w:pPr>
+        <w:pStyle w:val="Bibliography"/>
+      </w:pPr>
+      <w:r>
+        <w:t xml:space="preserve">CrashCourse. (2017).</w:t>
+      </w:r>
+      <w:r>
         <w:t xml:space="preserve"> </w:t>
       </w:r>
       <w:r>
@@ -21183,7 +21644,7 @@
           <w:i/>
           <w:iCs/>
         </w:rPr>
-        <w:t xml:space="preserve">Crash</w:t>
+        <w:t xml:space="preserve">Pitching and pre-production:</w:t>
       </w:r>
       <w:r>
         <w:rPr>
@@ -21197,7 +21658,7 @@
           <w:i/>
           <w:iCs/>
         </w:rPr>
-        <w:t xml:space="preserve">course film production with</w:t>
+        <w:t xml:space="preserve">Crash</w:t>
       </w:r>
       <w:r>
         <w:rPr>
@@ -21211,7 +21672,7 @@
           <w:i/>
           <w:iCs/>
         </w:rPr>
-        <w:t xml:space="preserve">Lily Gladstone</w:t>
+        <w:t xml:space="preserve">course film production with</w:t>
       </w:r>
       <w:r>
         <w:rPr>
@@ -21225,39 +21686,39 @@
           <w:i/>
           <w:iCs/>
         </w:rPr>
-        <w:t xml:space="preserve">#2</w:t>
-      </w:r>
-      <w:r>
-        <w:t xml:space="preserve"> </w:t>
-      </w:r>
-      <w:r>
-        <w:t xml:space="preserve">[Video]. YouTube.</w:t>
-      </w:r>
-    </w:p>
-    <w:bookmarkEnd w:id="118"/>
-    <w:bookmarkStart w:id="119" w:name="ref-d4dariousShootingFilmSTART2018"/>
-    <w:p>
-      <w:pPr>
-        <w:pStyle w:val="Bibliography"/>
-      </w:pPr>
-      <w:r>
-        <w:t xml:space="preserve">D4Darious. (2018).</w:t>
-      </w:r>
-      <w:r>
-        <w:t xml:space="preserve"> </w:t>
+        <w:t xml:space="preserve">Lily Gladstone</w:t>
       </w:r>
       <w:r>
         <w:rPr>
           <w:i/>
           <w:iCs/>
         </w:rPr>
-        <w:t xml:space="preserve">Shooting a film -</w:t>
+        <w:t xml:space="preserve"> </w:t>
       </w:r>
       <w:r>
         <w:rPr>
           <w:i/>
           <w:iCs/>
         </w:rPr>
+        <w:t xml:space="preserve">#2</w:t>
+      </w:r>
+      <w:r>
+        <w:t xml:space="preserve"> </w:t>
+      </w:r>
+      <w:r>
+        <w:t xml:space="preserve">[Video]. YouTube.</w:t>
+      </w:r>
+    </w:p>
+    <w:bookmarkEnd w:id="121"/>
+    <w:bookmarkStart w:id="122" w:name="ref-D4Darious"/>
+    <w:p>
+      <w:pPr>
+        <w:pStyle w:val="Bibliography"/>
+      </w:pPr>
+      <w:r>
+        <w:t xml:space="preserve">D4Darious. (2017).</w:t>
+      </w:r>
+      <w:r>
         <w:t xml:space="preserve"> </w:t>
       </w:r>
       <w:r>
@@ -21265,107 +21726,67 @@
           <w:i/>
           <w:iCs/>
         </w:rPr>
-        <w:t xml:space="preserve">START</w:t>
+        <w:t xml:space="preserve">8 essential skills you need for a career in filmmaking!</w:t>
+      </w:r>
+      <w:r>
+        <w:t xml:space="preserve"> </w:t>
+      </w:r>
+      <w:r>
+        <w:t xml:space="preserve">[Video]. YouTube.</w:t>
+      </w:r>
+    </w:p>
+    <w:bookmarkEnd w:id="122"/>
+    <w:bookmarkStart w:id="123" w:name="ref-d4dariousShootingFilmSTART2018"/>
+    <w:p>
+      <w:pPr>
+        <w:pStyle w:val="Bibliography"/>
+      </w:pPr>
+      <w:r>
+        <w:t xml:space="preserve">D4Darious. (2018).</w:t>
+      </w:r>
+      <w:r>
+        <w:t xml:space="preserve"> </w:t>
       </w:r>
       <w:r>
         <w:rPr>
           <w:i/>
           <w:iCs/>
         </w:rPr>
-        <w:t xml:space="preserve"> </w:t>
+        <w:t xml:space="preserve">Shooting a film -</w:t>
       </w:r>
       <w:r>
         <w:rPr>
           <w:i/>
           <w:iCs/>
         </w:rPr>
-        <w:t xml:space="preserve">to</w:t>
+        <w:t xml:space="preserve"> </w:t>
       </w:r>
       <w:r>
         <w:rPr>
           <w:i/>
           <w:iCs/>
         </w:rPr>
-        <w:t xml:space="preserve"> </w:t>
+        <w:t xml:space="preserve">START</w:t>
       </w:r>
       <w:r>
         <w:rPr>
           <w:i/>
           <w:iCs/>
         </w:rPr>
-        <w:t xml:space="preserve">FINISH</w:t>
+        <w:t xml:space="preserve"> </w:t>
       </w:r>
       <w:r>
         <w:rPr>
           <w:i/>
           <w:iCs/>
         </w:rPr>
-        <w:t xml:space="preserve">!</w:t>
-      </w:r>
-      <w:r>
-        <w:t xml:space="preserve"> </w:t>
-      </w:r>
-      <w:r>
-        <w:t xml:space="preserve">[Video]. YouTube.</w:t>
-      </w:r>
-    </w:p>
-    <w:bookmarkEnd w:id="119"/>
-    <w:bookmarkStart w:id="120" w:name="ref-Davenport21WaysDevelop2023"/>
-    <w:p>
-      <w:pPr>
-        <w:pStyle w:val="Bibliography"/>
-      </w:pPr>
-      <w:r>
-        <w:t xml:space="preserve">Davenport, B. (2023).</w:t>
-      </w:r>
-      <w:r>
-        <w:t xml:space="preserve"> </w:t>
+        <w:t xml:space="preserve">to</w:t>
       </w:r>
       <w:r>
         <w:rPr>
           <w:i/>
           <w:iCs/>
         </w:rPr>
-        <w:t xml:space="preserve">21 ways to develop your intuition</w:t>
-      </w:r>
-      <w:r>
-        <w:t xml:space="preserve">. https://liveboldandbloom.com/04/self-improvement/develop-your-intuition.</w:t>
-      </w:r>
-    </w:p>
-    <w:bookmarkEnd w:id="120"/>
-    <w:bookmarkStart w:id="121" w:name="ref-HistoryPlaceDorothea"/>
-    <w:p>
-      <w:pPr>
-        <w:pStyle w:val="Bibliography"/>
-      </w:pPr>
-      <w:r>
-        <w:t xml:space="preserve">Dorothea</w:t>
-      </w:r>
-      <w:r>
-        <w:t xml:space="preserve"> </w:t>
-      </w:r>
-      <w:r>
-        <w:t xml:space="preserve">Lange</w:t>
-      </w:r>
-      <w:r>
-        <w:t xml:space="preserve"> </w:t>
-      </w:r>
-      <w:r>
-        <w:t xml:space="preserve">photo gallery:</w:t>
-      </w:r>
-      <w:r>
-        <w:t xml:space="preserve"> </w:t>
-      </w:r>
-      <w:r>
-        <w:t xml:space="preserve">Migrant</w:t>
-      </w:r>
-      <w:r>
-        <w:t xml:space="preserve"> </w:t>
-      </w:r>
-      <w:r>
-        <w:t xml:space="preserve">farm families. (n.d.). In</w:t>
-      </w:r>
-      <w:r>
         <w:t xml:space="preserve"> </w:t>
       </w:r>
       <w:r>
@@ -21373,43 +21794,30 @@
           <w:i/>
           <w:iCs/>
         </w:rPr>
-        <w:t xml:space="preserve">The History Place</w:t>
-      </w:r>
-      <w:r>
-        <w:t xml:space="preserve">. https://www.historyplace.com/unitedstates/lange/.</w:t>
-      </w:r>
-    </w:p>
-    <w:bookmarkEnd w:id="121"/>
-    <w:bookmarkStart w:id="122" w:name="ref-FamousPhotographersPose2015"/>
-    <w:p>
-      <w:pPr>
-        <w:pStyle w:val="Bibliography"/>
-      </w:pPr>
-      <w:r>
-        <w:t xml:space="preserve">Dovas. (2015). Famous photographers pose behind their iconic images. In</w:t>
-      </w:r>
-      <w:r>
-        <w:t xml:space="preserve"> </w:t>
+        <w:t xml:space="preserve">FINISH</w:t>
       </w:r>
       <w:r>
         <w:rPr>
           <w:i/>
           <w:iCs/>
         </w:rPr>
-        <w:t xml:space="preserve">Bored Panda</w:t>
-      </w:r>
-      <w:r>
-        <w:t xml:space="preserve">. https://www.boredpanda.com/famous-photographer-portraits-behind-photographs-tim-mantoani/.</w:t>
-      </w:r>
-    </w:p>
-    <w:bookmarkEnd w:id="122"/>
-    <w:bookmarkStart w:id="123" w:name="ref-Filmriots2017"/>
+        <w:t xml:space="preserve">!</w:t>
+      </w:r>
+      <w:r>
+        <w:t xml:space="preserve"> </w:t>
+      </w:r>
+      <w:r>
+        <w:t xml:space="preserve">[Video]. YouTube.</w:t>
+      </w:r>
+    </w:p>
+    <w:bookmarkEnd w:id="123"/>
+    <w:bookmarkStart w:id="124" w:name="ref-Davenport21WaysDevelop2023"/>
     <w:p>
       <w:pPr>
         <w:pStyle w:val="Bibliography"/>
       </w:pPr>
       <w:r>
-        <w:t xml:space="preserve">Film Riot. (2017).</w:t>
+        <w:t xml:space="preserve">Davenport, B. (2023).</w:t>
       </w:r>
       <w:r>
         <w:t xml:space="preserve"> </w:t>
@@ -21419,13 +21827,69 @@
           <w:i/>
           <w:iCs/>
         </w:rPr>
-        <w:t xml:space="preserve">Visual</w:t>
+        <w:t xml:space="preserve">21 ways to develop your intuition</w:t>
+      </w:r>
+      <w:r>
+        <w:t xml:space="preserve">. https://liveboldandbloom.com/04/self-improvement/develop-your-intuition.</w:t>
+      </w:r>
+    </w:p>
+    <w:bookmarkEnd w:id="124"/>
+    <w:bookmarkStart w:id="125" w:name="ref-HistoryPlaceDorothea"/>
+    <w:p>
+      <w:pPr>
+        <w:pStyle w:val="Bibliography"/>
+      </w:pPr>
+      <w:r>
+        <w:t xml:space="preserve">Dorothea</w:t>
+      </w:r>
+      <w:r>
+        <w:t xml:space="preserve"> </w:t>
+      </w:r>
+      <w:r>
+        <w:t xml:space="preserve">Lange</w:t>
+      </w:r>
+      <w:r>
+        <w:t xml:space="preserve"> </w:t>
+      </w:r>
+      <w:r>
+        <w:t xml:space="preserve">photo gallery:</w:t>
+      </w:r>
+      <w:r>
+        <w:t xml:space="preserve"> </w:t>
+      </w:r>
+      <w:r>
+        <w:t xml:space="preserve">Migrant</w:t>
+      </w:r>
+      <w:r>
+        <w:t xml:space="preserve"> </w:t>
+      </w:r>
+      <w:r>
+        <w:t xml:space="preserve">farm families. (n.d.). In</w:t>
+      </w:r>
+      <w:r>
+        <w:t xml:space="preserve"> </w:t>
       </w:r>
       <w:r>
         <w:rPr>
           <w:i/>
           <w:iCs/>
         </w:rPr>
+        <w:t xml:space="preserve">The History Place</w:t>
+      </w:r>
+      <w:r>
+        <w:t xml:space="preserve">. https://www.historyplace.com/unitedstates/lange/.</w:t>
+      </w:r>
+    </w:p>
+    <w:bookmarkEnd w:id="125"/>
+    <w:bookmarkStart w:id="126" w:name="ref-FamousPhotographersPose2015"/>
+    <w:p>
+      <w:pPr>
+        <w:pStyle w:val="Bibliography"/>
+      </w:pPr>
+      <w:r>
+        <w:t xml:space="preserve">Dovas. (2015). Famous photographers pose behind their iconic images. In</w:t>
+      </w:r>
+      <w:r>
         <w:t xml:space="preserve"> </w:t>
       </w:r>
       <w:r>
@@ -21433,36 +21897,36 @@
           <w:i/>
           <w:iCs/>
         </w:rPr>
-        <w:t xml:space="preserve">Storytelling</w:t>
+        <w:t xml:space="preserve">Bored Panda</w:t>
+      </w:r>
+      <w:r>
+        <w:t xml:space="preserve">. https://www.boredpanda.com/famous-photographer-portraits-behind-photographs-tim-mantoani/.</w:t>
+      </w:r>
+    </w:p>
+    <w:bookmarkEnd w:id="126"/>
+    <w:bookmarkStart w:id="127" w:name="ref-fandorSFXSecretsCut2018"/>
+    <w:p>
+      <w:pPr>
+        <w:pStyle w:val="Bibliography"/>
+      </w:pPr>
+      <w:r>
+        <w:t xml:space="preserve">Fandor. (2018).</w:t>
+      </w:r>
+      <w:r>
+        <w:t xml:space="preserve"> </w:t>
       </w:r>
       <w:r>
         <w:rPr>
           <w:i/>
           <w:iCs/>
         </w:rPr>
-        <w:t xml:space="preserve"> </w:t>
+        <w:t xml:space="preserve">SFX</w:t>
       </w:r>
       <w:r>
         <w:rPr>
           <w:i/>
           <w:iCs/>
         </w:rPr>
-        <w:t xml:space="preserve">101</w:t>
-      </w:r>
-      <w:r>
-        <w:t xml:space="preserve">.</w:t>
-      </w:r>
-    </w:p>
-    <w:bookmarkEnd w:id="123"/>
-    <w:bookmarkStart w:id="124" w:name="ref-filmriotCritiquingYourShort2018"/>
-    <w:p>
-      <w:pPr>
-        <w:pStyle w:val="Bibliography"/>
-      </w:pPr>
-      <w:r>
-        <w:t xml:space="preserve">Film Riot. (2018).</w:t>
-      </w:r>
-      <w:r>
         <w:t xml:space="preserve"> </w:t>
       </w:r>
       <w:r>
@@ -21470,48 +21934,13 @@
           <w:i/>
           <w:iCs/>
         </w:rPr>
-        <w:t xml:space="preserve">Critiquing your short films</w:t>
-      </w:r>
-      <w:r>
-        <w:t xml:space="preserve"> </w:t>
-      </w:r>
-      <w:r>
-        <w:t xml:space="preserve">[Video]. YouTube.</w:t>
-      </w:r>
-    </w:p>
-    <w:bookmarkEnd w:id="124"/>
-    <w:bookmarkStart w:id="125" w:name="ref-grove19GreatWays2015"/>
-    <w:p>
-      <w:pPr>
-        <w:pStyle w:val="Bibliography"/>
-      </w:pPr>
-      <w:r>
-        <w:t xml:space="preserve">Grove, E. (2015). 19 great ways to brainstorm short film ideas. In</w:t>
-      </w:r>
-      <w:r>
-        <w:t xml:space="preserve"> </w:t>
+        <w:t xml:space="preserve">secrets:</w:t>
       </w:r>
       <w:r>
         <w:rPr>
           <w:i/>
           <w:iCs/>
         </w:rPr>
-        <w:t xml:space="preserve">IndieWire</w:t>
-      </w:r>
-      <w:r>
-        <w:t xml:space="preserve">.</w:t>
-      </w:r>
-    </w:p>
-    <w:bookmarkEnd w:id="125"/>
-    <w:bookmarkStart w:id="126" w:name="ref-Gvfstudio2013"/>
-    <w:p>
-      <w:pPr>
-        <w:pStyle w:val="Bibliography"/>
-      </w:pPr>
-      <w:r>
-        <w:t xml:space="preserve">Gvfstudio. (2013).</w:t>
-      </w:r>
-      <w:r>
         <w:t xml:space="preserve"> </w:t>
       </w:r>
       <w:r>
@@ -21519,48 +21948,13 @@
           <w:i/>
           <w:iCs/>
         </w:rPr>
-        <w:t xml:space="preserve">Screen direction rule</w:t>
-      </w:r>
-      <w:r>
-        <w:t xml:space="preserve"> </w:t>
-      </w:r>
-      <w:r>
-        <w:t xml:space="preserve">[Video]. YouTube.</w:t>
-      </w:r>
-    </w:p>
-    <w:bookmarkEnd w:id="126"/>
-    <w:bookmarkStart w:id="127" w:name="ref-keiserHowGrowProfessionally2018"/>
-    <w:p>
-      <w:pPr>
-        <w:pStyle w:val="Bibliography"/>
-      </w:pPr>
-      <w:r>
-        <w:t xml:space="preserve">Keiser, A. (2018). How to grow professionally. In</w:t>
-      </w:r>
-      <w:r>
-        <w:t xml:space="preserve"> </w:t>
+        <w:t xml:space="preserve">The J</w:t>
       </w:r>
       <w:r>
         <w:rPr>
           <w:i/>
           <w:iCs/>
         </w:rPr>
-        <w:t xml:space="preserve">BrandYourself blog</w:t>
-      </w:r>
-      <w:r>
-        <w:t xml:space="preserve">. https://brandyourself.com/blog/guide/how-to-grow-professionally/.</w:t>
-      </w:r>
-    </w:p>
-    <w:bookmarkEnd w:id="127"/>
-    <w:bookmarkStart w:id="128" w:name="ref-iankillickEyelineMatch2014"/>
-    <w:p>
-      <w:pPr>
-        <w:pStyle w:val="Bibliography"/>
-      </w:pPr>
-      <w:r>
-        <w:t xml:space="preserve">Killick, I. (2014).</w:t>
-      </w:r>
-      <w:r>
         <w:t xml:space="preserve"> </w:t>
       </w:r>
       <w:r>
@@ -21568,60 +21962,13 @@
           <w:i/>
           <w:iCs/>
         </w:rPr>
-        <w:t xml:space="preserve">The eyeline match</w:t>
-      </w:r>
-      <w:r>
-        <w:t xml:space="preserve"> </w:t>
-      </w:r>
-      <w:r>
-        <w:t xml:space="preserve">[Video]. YouTube.</w:t>
-      </w:r>
-    </w:p>
-    <w:bookmarkEnd w:id="128"/>
-    <w:bookmarkStart w:id="129" w:name="ref-17LessonsHenri2014"/>
-    <w:p>
-      <w:pPr>
-        <w:pStyle w:val="Bibliography"/>
-      </w:pPr>
-      <w:r>
-        <w:t xml:space="preserve">Kim, E. (2014). 17 lessons</w:t>
-      </w:r>
-      <w:r>
-        <w:t xml:space="preserve"> </w:t>
-      </w:r>
-      <w:r>
-        <w:t xml:space="preserve">Henri Cartier-Bresson</w:t>
-      </w:r>
-      <w:r>
-        <w:t xml:space="preserve"> </w:t>
-      </w:r>
-      <w:r>
-        <w:t xml:space="preserve">has taught me about street photography. In</w:t>
-      </w:r>
-      <w:r>
-        <w:t xml:space="preserve"> </w:t>
+        <w:t xml:space="preserve">cut &amp; the</w:t>
       </w:r>
       <w:r>
         <w:rPr>
           <w:i/>
           <w:iCs/>
         </w:rPr>
-        <w:t xml:space="preserve">Eric Kim ₿ ₿log</w:t>
-      </w:r>
-      <w:r>
-        <w:t xml:space="preserve">.</w:t>
-      </w:r>
-    </w:p>
-    <w:bookmarkEnd w:id="129"/>
-    <w:bookmarkStart w:id="130" w:name="X101f762b79795529ab4fa800f2cc5614c63733f"/>
-    <w:p>
-      <w:pPr>
-        <w:pStyle w:val="Bibliography"/>
-      </w:pPr>
-      <w:r>
-        <w:t xml:space="preserve">ManWithNoName. (2016).</w:t>
-      </w:r>
-      <w:r>
         <w:t xml:space="preserve"> </w:t>
       </w:r>
       <w:r>
@@ -21629,39 +21976,39 @@
           <w:i/>
           <w:iCs/>
         </w:rPr>
-        <w:t xml:space="preserve">Introduction to shot types and camera movement</w:t>
-      </w:r>
-      <w:r>
-        <w:t xml:space="preserve"> </w:t>
-      </w:r>
-      <w:r>
-        <w:t xml:space="preserve">[Video]. YouTube.</w:t>
-      </w:r>
-    </w:p>
-    <w:bookmarkEnd w:id="130"/>
-    <w:bookmarkStart w:id="131" w:name="X4431e898d182139968e3fc50e9f2730ffbbf3cf"/>
-    <w:p>
-      <w:pPr>
-        <w:pStyle w:val="Bibliography"/>
-      </w:pPr>
-      <w:r>
-        <w:t xml:space="preserve">Mike Olbinski Photography. (2017).</w:t>
-      </w:r>
-      <w:r>
-        <w:t xml:space="preserve"> </w:t>
+        <w:t xml:space="preserve">L</w:t>
       </w:r>
       <w:r>
         <w:rPr>
           <w:i/>
           <w:iCs/>
         </w:rPr>
-        <w:t xml:space="preserve">Pursuit -</w:t>
+        <w:t xml:space="preserve"> </w:t>
       </w:r>
       <w:r>
         <w:rPr>
           <w:i/>
           <w:iCs/>
         </w:rPr>
+        <w:t xml:space="preserve">cut</w:t>
+      </w:r>
+      <w:r>
+        <w:t xml:space="preserve"> </w:t>
+      </w:r>
+      <w:r>
+        <w:t xml:space="preserve">[Video]. YouTube.</w:t>
+      </w:r>
+    </w:p>
+    <w:bookmarkEnd w:id="127"/>
+    <w:bookmarkStart w:id="128" w:name="ref-Filmriot2011"/>
+    <w:p>
+      <w:pPr>
+        <w:pStyle w:val="Bibliography"/>
+      </w:pPr>
+      <w:r>
+        <w:t xml:space="preserve">Film Riot. (2011).</w:t>
+      </w:r>
+      <w:r>
         <w:t xml:space="preserve"> </w:t>
       </w:r>
       <w:r>
@@ -21669,39 +22016,39 @@
           <w:i/>
           <w:iCs/>
         </w:rPr>
-        <w:t xml:space="preserve">A 4K</w:t>
+        <w:t xml:space="preserve">How to shoot a scene!</w:t>
+      </w:r>
+      <w:r>
+        <w:t xml:space="preserve"> </w:t>
+      </w:r>
+      <w:r>
+        <w:t xml:space="preserve">[Video]. YouTube.</w:t>
+      </w:r>
+    </w:p>
+    <w:bookmarkEnd w:id="128"/>
+    <w:bookmarkStart w:id="129" w:name="ref-Filmriots2017"/>
+    <w:p>
+      <w:pPr>
+        <w:pStyle w:val="Bibliography"/>
+      </w:pPr>
+      <w:r>
+        <w:t xml:space="preserve">Film Riot. (2017).</w:t>
+      </w:r>
+      <w:r>
+        <w:t xml:space="preserve"> </w:t>
       </w:r>
       <w:r>
         <w:rPr>
           <w:i/>
           <w:iCs/>
         </w:rPr>
-        <w:t xml:space="preserve"> </w:t>
+        <w:t xml:space="preserve">Visual</w:t>
       </w:r>
       <w:r>
         <w:rPr>
           <w:i/>
           <w:iCs/>
         </w:rPr>
-        <w:t xml:space="preserve">storm time-lapse film</w:t>
-      </w:r>
-      <w:r>
-        <w:t xml:space="preserve"> </w:t>
-      </w:r>
-      <w:r>
-        <w:t xml:space="preserve">[Video]. YouTube.</w:t>
-      </w:r>
-    </w:p>
-    <w:bookmarkEnd w:id="131"/>
-    <w:bookmarkStart w:id="132" w:name="ref-on30WaysBrainstorm2019"/>
-    <w:p>
-      <w:pPr>
-        <w:pStyle w:val="Bibliography"/>
-      </w:pPr>
-      <w:r>
-        <w:t xml:space="preserve">Muehleck, C. (2019).</w:t>
-      </w:r>
-      <w:r>
         <w:t xml:space="preserve"> </w:t>
       </w:r>
       <w:r>
@@ -21709,48 +22056,13 @@
           <w:i/>
           <w:iCs/>
         </w:rPr>
-        <w:t xml:space="preserve">30 ways to brainstorm short film ideas you can actually produce</w:t>
-      </w:r>
-      <w:r>
-        <w:t xml:space="preserve">. https://www.studiobinder.com/blog/short-film-ideas-you-can-actually-produce/.</w:t>
-      </w:r>
-    </w:p>
-    <w:bookmarkEnd w:id="132"/>
-    <w:bookmarkStart w:id="133" w:name="ref-mattraglandHowJournalEvery2018"/>
-    <w:p>
-      <w:pPr>
-        <w:pStyle w:val="Bibliography"/>
-      </w:pPr>
-      <w:r>
-        <w:t xml:space="preserve">Ragland, M. (2018).</w:t>
-      </w:r>
-      <w:r>
-        <w:t xml:space="preserve"> </w:t>
+        <w:t xml:space="preserve">Storytelling</w:t>
       </w:r>
       <w:r>
         <w:rPr>
           <w:i/>
           <w:iCs/>
         </w:rPr>
-        <w:t xml:space="preserve">How to journal every day for increased productivity, clarity, and mental health</w:t>
-      </w:r>
-      <w:r>
-        <w:t xml:space="preserve"> </w:t>
-      </w:r>
-      <w:r>
-        <w:t xml:space="preserve">[Video]. YouTube.</w:t>
-      </w:r>
-    </w:p>
-    <w:bookmarkEnd w:id="133"/>
-    <w:bookmarkStart w:id="134" w:name="X9199323d4ed499656bf8f02a24db82642634b8e"/>
-    <w:p>
-      <w:pPr>
-        <w:pStyle w:val="Bibliography"/>
-      </w:pPr>
-      <w:r>
-        <w:t xml:space="preserve">RocketJump Film School. (2016).</w:t>
-      </w:r>
-      <w:r>
         <w:t xml:space="preserve"> </w:t>
       </w:r>
       <w:r>
@@ -21758,23 +22070,20 @@
           <w:i/>
           <w:iCs/>
         </w:rPr>
-        <w:t xml:space="preserve">Cuts &amp; transitions 101</w:t>
-      </w:r>
-      <w:r>
-        <w:t xml:space="preserve"> </w:t>
-      </w:r>
-      <w:r>
-        <w:t xml:space="preserve">[Video]. YouTube.</w:t>
-      </w:r>
-    </w:p>
-    <w:bookmarkEnd w:id="134"/>
-    <w:bookmarkStart w:id="135" w:name="ref-shutterstocktutorials9CutsEvery2018"/>
+        <w:t xml:space="preserve">101</w:t>
+      </w:r>
+      <w:r>
+        <w:t xml:space="preserve">.</w:t>
+      </w:r>
+    </w:p>
+    <w:bookmarkEnd w:id="129"/>
+    <w:bookmarkStart w:id="130" w:name="ref-filmriotCritiquingYourShort2018"/>
     <w:p>
       <w:pPr>
         <w:pStyle w:val="Bibliography"/>
       </w:pPr>
       <w:r>
-        <w:t xml:space="preserve">Shutterstock Tutorials. (2018).</w:t>
+        <w:t xml:space="preserve">Film Riot. (2018).</w:t>
       </w:r>
       <w:r>
         <w:t xml:space="preserve"> </w:t>
@@ -21784,13 +22093,48 @@
           <w:i/>
           <w:iCs/>
         </w:rPr>
-        <w:t xml:space="preserve">9 cuts every video editor should know</w:t>
+        <w:t xml:space="preserve">Critiquing your short films</w:t>
+      </w:r>
+      <w:r>
+        <w:t xml:space="preserve"> </w:t>
+      </w:r>
+      <w:r>
+        <w:t xml:space="preserve">[Video]. YouTube.</w:t>
+      </w:r>
+    </w:p>
+    <w:bookmarkEnd w:id="130"/>
+    <w:bookmarkStart w:id="131" w:name="ref-grove19GreatWays2015"/>
+    <w:p>
+      <w:pPr>
+        <w:pStyle w:val="Bibliography"/>
+      </w:pPr>
+      <w:r>
+        <w:t xml:space="preserve">Grove, E. (2015). 19 great ways to brainstorm short film ideas. In</w:t>
+      </w:r>
+      <w:r>
+        <w:t xml:space="preserve"> </w:t>
       </w:r>
       <w:r>
         <w:rPr>
           <w:i/>
           <w:iCs/>
         </w:rPr>
+        <w:t xml:space="preserve">IndieWire</w:t>
+      </w:r>
+      <w:r>
+        <w:t xml:space="preserve">.</w:t>
+      </w:r>
+    </w:p>
+    <w:bookmarkEnd w:id="131"/>
+    <w:bookmarkStart w:id="132" w:name="ref-Gvfstudio2013"/>
+    <w:p>
+      <w:pPr>
+        <w:pStyle w:val="Bibliography"/>
+      </w:pPr>
+      <w:r>
+        <w:t xml:space="preserve">Gvfstudio. (2013).</w:t>
+      </w:r>
+      <w:r>
         <w:t xml:space="preserve"> </w:t>
       </w:r>
       <w:r>
@@ -21798,6 +22142,25 @@
           <w:i/>
           <w:iCs/>
         </w:rPr>
+        <w:t xml:space="preserve">Screen direction rule</w:t>
+      </w:r>
+      <w:r>
+        <w:t xml:space="preserve"> </w:t>
+      </w:r>
+      <w:r>
+        <w:t xml:space="preserve">[Video]. YouTube.</w:t>
+      </w:r>
+    </w:p>
+    <w:bookmarkEnd w:id="132"/>
+    <w:bookmarkStart w:id="133" w:name="ref-Haapoja2018"/>
+    <w:p>
+      <w:pPr>
+        <w:pStyle w:val="Bibliography"/>
+      </w:pPr>
+      <w:r>
+        <w:t xml:space="preserve">Haapoja, M. (2018).</w:t>
+      </w:r>
+      <w:r>
         <w:t xml:space="preserve"> </w:t>
       </w:r>
       <w:r>
@@ -21805,39 +22168,39 @@
           <w:i/>
           <w:iCs/>
         </w:rPr>
-        <w:t xml:space="preserve">Filmmaking</w:t>
+        <w:t xml:space="preserve">20+ film set jobs for you</w:t>
+      </w:r>
+      <w:r>
+        <w:t xml:space="preserve"> </w:t>
+      </w:r>
+      <w:r>
+        <w:t xml:space="preserve">[Video]. YouTube.</w:t>
+      </w:r>
+    </w:p>
+    <w:bookmarkEnd w:id="133"/>
+    <w:bookmarkStart w:id="134" w:name="ref-kylerhollandVideoEditingTips2018"/>
+    <w:p>
+      <w:pPr>
+        <w:pStyle w:val="Bibliography"/>
+      </w:pPr>
+      <w:r>
+        <w:t xml:space="preserve">Holland, K. (2018).</w:t>
+      </w:r>
+      <w:r>
+        <w:t xml:space="preserve"> </w:t>
       </w:r>
       <w:r>
         <w:rPr>
           <w:i/>
           <w:iCs/>
         </w:rPr>
-        <w:t xml:space="preserve"> </w:t>
+        <w:t xml:space="preserve">Video editing tips:</w:t>
       </w:r>
       <w:r>
         <w:rPr>
           <w:i/>
           <w:iCs/>
         </w:rPr>
-        <w:t xml:space="preserve">tips</w:t>
-      </w:r>
-      <w:r>
-        <w:t xml:space="preserve"> </w:t>
-      </w:r>
-      <w:r>
-        <w:t xml:space="preserve">[Video]. YouTube.</w:t>
-      </w:r>
-    </w:p>
-    <w:bookmarkEnd w:id="135"/>
-    <w:bookmarkStart w:id="136" w:name="ref-surfacedstudioFilmMaking1012016"/>
-    <w:p>
-      <w:pPr>
-        <w:pStyle w:val="Bibliography"/>
-      </w:pPr>
-      <w:r>
-        <w:t xml:space="preserve">Surfaced Studio. (2016).</w:t>
-      </w:r>
-      <w:r>
         <w:t xml:space="preserve"> </w:t>
       </w:r>
       <w:r>
@@ -21845,7 +22208,7 @@
           <w:i/>
           <w:iCs/>
         </w:rPr>
-        <w:t xml:space="preserve">Film making 101 tutorial -</w:t>
+        <w:t xml:space="preserve">J</w:t>
       </w:r>
       <w:r>
         <w:rPr>
@@ -21859,7 +22222,7 @@
           <w:i/>
           <w:iCs/>
         </w:rPr>
-        <w:t xml:space="preserve">L</w:t>
+        <w:t xml:space="preserve">cut vs</w:t>
       </w:r>
       <w:r>
         <w:rPr>
@@ -21873,7 +22236,7 @@
           <w:i/>
           <w:iCs/>
         </w:rPr>
-        <w:t xml:space="preserve">&amp;</w:t>
+        <w:t xml:space="preserve">L</w:t>
       </w:r>
       <w:r>
         <w:rPr>
@@ -21887,39 +22250,36 @@
           <w:i/>
           <w:iCs/>
         </w:rPr>
-        <w:t xml:space="preserve">J</w:t>
+        <w:t xml:space="preserve">cut</w:t>
+      </w:r>
+      <w:r>
+        <w:t xml:space="preserve">. YouTube.</w:t>
+      </w:r>
+    </w:p>
+    <w:bookmarkEnd w:id="134"/>
+    <w:bookmarkStart w:id="135" w:name="ref-jaredishamMasterArtShot2017"/>
+    <w:p>
+      <w:pPr>
+        <w:pStyle w:val="Bibliography"/>
+      </w:pPr>
+      <w:r>
+        <w:t xml:space="preserve">Isham, J. (2017).</w:t>
+      </w:r>
+      <w:r>
+        <w:t xml:space="preserve"> </w:t>
       </w:r>
       <w:r>
         <w:rPr>
           <w:i/>
           <w:iCs/>
         </w:rPr>
-        <w:t xml:space="preserve"> </w:t>
+        <w:t xml:space="preserve">Master the art of shot lists:</w:t>
       </w:r>
       <w:r>
         <w:rPr>
           <w:i/>
           <w:iCs/>
         </w:rPr>
-        <w:t xml:space="preserve">cuts</w:t>
-      </w:r>
-      <w:r>
-        <w:t xml:space="preserve"> </w:t>
-      </w:r>
-      <w:r>
-        <w:t xml:space="preserve">[Video]. YouTube.</w:t>
-      </w:r>
-    </w:p>
-    <w:bookmarkEnd w:id="136"/>
-    <w:bookmarkStart w:id="137" w:name="ref-Principlesofdesign"/>
-    <w:p>
-      <w:pPr>
-        <w:pStyle w:val="Bibliography"/>
-      </w:pPr>
-      <w:r>
-        <w:t xml:space="preserve">The J. Paul Getty Musuem. (2011).</w:t>
-      </w:r>
-      <w:r>
         <w:t xml:space="preserve"> </w:t>
       </w:r>
       <w:r>
@@ -21927,48 +22287,13 @@
           <w:i/>
           <w:iCs/>
         </w:rPr>
-        <w:t xml:space="preserve">Principles of design</w:t>
-      </w:r>
-      <w:r>
-        <w:t xml:space="preserve">.</w:t>
-      </w:r>
-    </w:p>
-    <w:bookmarkEnd w:id="137"/>
-    <w:bookmarkStart w:id="138" w:name="ref-theslantedlens8CinematicCamera2018"/>
-    <w:p>
-      <w:pPr>
-        <w:pStyle w:val="Bibliography"/>
-      </w:pPr>
-      <w:r>
-        <w:t xml:space="preserve">The Slanted Lens. (2018).</w:t>
-      </w:r>
-      <w:r>
-        <w:t xml:space="preserve"> </w:t>
+        <w:t xml:space="preserve">Boost</w:t>
       </w:r>
       <w:r>
         <w:rPr>
           <w:i/>
           <w:iCs/>
         </w:rPr>
-        <w:t xml:space="preserve">8 cinematic camera moves for video</w:t>
-      </w:r>
-      <w:r>
-        <w:t xml:space="preserve"> </w:t>
-      </w:r>
-      <w:r>
-        <w:t xml:space="preserve">[Video]. YouTube.</w:t>
-      </w:r>
-    </w:p>
-    <w:bookmarkEnd w:id="138"/>
-    <w:bookmarkStart w:id="139" w:name="ref-TalentCode"/>
-    <w:p>
-      <w:pPr>
-        <w:pStyle w:val="Bibliography"/>
-      </w:pPr>
-      <w:r>
-        <w:t xml:space="preserve">The talent code. (n.d.). In</w:t>
-      </w:r>
-      <w:r>
         <w:t xml:space="preserve"> </w:t>
       </w:r>
       <w:r>
@@ -21976,20 +22301,23 @@
           <w:i/>
           <w:iCs/>
         </w:rPr>
-        <w:t xml:space="preserve">Daniel Coyle</w:t>
-      </w:r>
-      <w:r>
-        <w:t xml:space="preserve">.</w:t>
-      </w:r>
-    </w:p>
-    <w:bookmarkEnd w:id="139"/>
-    <w:bookmarkStart w:id="140" w:name="ref-VankevichDigitalFilmmaking"/>
+        <w:t xml:space="preserve">your filmmaking efficiency!</w:t>
+      </w:r>
+      <w:r>
+        <w:t xml:space="preserve"> </w:t>
+      </w:r>
+      <w:r>
+        <w:t xml:space="preserve">[Video]. YouTube.</w:t>
+      </w:r>
+    </w:p>
+    <w:bookmarkEnd w:id="135"/>
+    <w:bookmarkStart w:id="136" w:name="ref-kaicreative30DegreeRule2017"/>
     <w:p>
       <w:pPr>
         <w:pStyle w:val="Bibliography"/>
       </w:pPr>
       <w:r>
-        <w:t xml:space="preserve">Vankevich, N. (n.d.).</w:t>
+        <w:t xml:space="preserve">KaiCreative. (2017).</w:t>
       </w:r>
       <w:r>
         <w:t xml:space="preserve"> </w:t>
@@ -21999,13 +22327,48 @@
           <w:i/>
           <w:iCs/>
         </w:rPr>
-        <w:t xml:space="preserve">Digital filmmaking:</w:t>
+        <w:t xml:space="preserve">The 30 degree rule in filmmaking</w:t>
+      </w:r>
+      <w:r>
+        <w:t xml:space="preserve"> </w:t>
+      </w:r>
+      <w:r>
+        <w:t xml:space="preserve">[Video]. YouTube.</w:t>
+      </w:r>
+    </w:p>
+    <w:bookmarkEnd w:id="136"/>
+    <w:bookmarkStart w:id="137" w:name="ref-keiserHowGrowProfessionally2018"/>
+    <w:p>
+      <w:pPr>
+        <w:pStyle w:val="Bibliography"/>
+      </w:pPr>
+      <w:r>
+        <w:t xml:space="preserve">Keiser, A. (2018). How to grow professionally. In</w:t>
+      </w:r>
+      <w:r>
+        <w:t xml:space="preserve"> </w:t>
       </w:r>
       <w:r>
         <w:rPr>
           <w:i/>
           <w:iCs/>
         </w:rPr>
+        <w:t xml:space="preserve">BrandYourself blog</w:t>
+      </w:r>
+      <w:r>
+        <w:t xml:space="preserve">. https://brandyourself.com/blog/guide/how-to-grow-professionally/.</w:t>
+      </w:r>
+    </w:p>
+    <w:bookmarkEnd w:id="137"/>
+    <w:bookmarkStart w:id="138" w:name="ref-Killick2014"/>
+    <w:p>
+      <w:pPr>
+        <w:pStyle w:val="Bibliography"/>
+      </w:pPr>
+      <w:r>
+        <w:t xml:space="preserve">Killick, I. (2014a).</w:t>
+      </w:r>
+      <w:r>
         <w:t xml:space="preserve"> </w:t>
       </w:r>
       <w:r>
@@ -22013,13 +22376,63 @@
           <w:i/>
           <w:iCs/>
         </w:rPr>
-        <w:t xml:space="preserve">A</w:t>
+        <w:t xml:space="preserve">Screen direction</w:t>
+      </w:r>
+      <w:r>
+        <w:t xml:space="preserve"> </w:t>
+      </w:r>
+      <w:r>
+        <w:t xml:space="preserve">[Video]. YouTube.</w:t>
+      </w:r>
+    </w:p>
+    <w:bookmarkEnd w:id="138"/>
+    <w:bookmarkStart w:id="139" w:name="ref-iankillickEyelineMatch2014"/>
+    <w:p>
+      <w:pPr>
+        <w:pStyle w:val="Bibliography"/>
+      </w:pPr>
+      <w:r>
+        <w:t xml:space="preserve">Killick, I. (2014b).</w:t>
+      </w:r>
+      <w:r>
+        <w:t xml:space="preserve"> </w:t>
       </w:r>
       <w:r>
         <w:rPr>
           <w:i/>
           <w:iCs/>
         </w:rPr>
+        <w:t xml:space="preserve">The eyeline match</w:t>
+      </w:r>
+      <w:r>
+        <w:t xml:space="preserve"> </w:t>
+      </w:r>
+      <w:r>
+        <w:t xml:space="preserve">[Video]. YouTube.</w:t>
+      </w:r>
+    </w:p>
+    <w:bookmarkEnd w:id="139"/>
+    <w:bookmarkStart w:id="140" w:name="ref-17LessonsHenri2014"/>
+    <w:p>
+      <w:pPr>
+        <w:pStyle w:val="Bibliography"/>
+      </w:pPr>
+      <w:r>
+        <w:t xml:space="preserve">Kim, E. (2014). 17 lessons</w:t>
+      </w:r>
+      <w:r>
+        <w:t xml:space="preserve"> </w:t>
+      </w:r>
+      <w:r>
+        <w:t xml:space="preserve">Henri Cartier-Bresson</w:t>
+      </w:r>
+      <w:r>
+        <w:t xml:space="preserve"> </w:t>
+      </w:r>
+      <w:r>
+        <w:t xml:space="preserve">has taught me about street photography. In</w:t>
+      </w:r>
+      <w:r>
         <w:t xml:space="preserve"> </w:t>
       </w:r>
       <w:r>
@@ -22027,32 +22440,20 @@
           <w:i/>
           <w:iCs/>
         </w:rPr>
-        <w:t xml:space="preserve">beginner’s guide to mastering the craft</w:t>
+        <w:t xml:space="preserve">Eric Kim ₿ ₿log</w:t>
       </w:r>
       <w:r>
         <w:t xml:space="preserve">.</w:t>
       </w:r>
     </w:p>
     <w:bookmarkEnd w:id="140"/>
-    <w:bookmarkStart w:id="141" w:name="ref-11ThoughtsIntroduction"/>
+    <w:bookmarkStart w:id="141" w:name="X101f762b79795529ab4fa800f2cc5614c63733f"/>
     <w:p>
       <w:pPr>
         <w:pStyle w:val="Bibliography"/>
       </w:pPr>
       <w:r>
-        <w:t xml:space="preserve">Vorenkamp, T. (2016). 11 thoughts:</w:t>
-      </w:r>
-      <w:r>
-        <w:t xml:space="preserve"> </w:t>
-      </w:r>
-      <w:r>
-        <w:t xml:space="preserve">An</w:t>
-      </w:r>
-      <w:r>
-        <w:t xml:space="preserve"> </w:t>
-      </w:r>
-      <w:r>
-        <w:t xml:space="preserve">introduction to photographic composition. In</w:t>
+        <w:t xml:space="preserve">ManWithNoName. (2016).</w:t>
       </w:r>
       <w:r>
         <w:t xml:space="preserve"> </w:t>
@@ -22062,32 +22463,23 @@
           <w:i/>
           <w:iCs/>
         </w:rPr>
-        <w:t xml:space="preserve">Bhphotovideo</w:t>
-      </w:r>
-      <w:r>
-        <w:t xml:space="preserve">. https://www.bhphotovideo.com/explora/photography/tips-and-solutions/11-thoughts-an-introduction-to-photographic-composition.</w:t>
+        <w:t xml:space="preserve">Introduction to shot types and camera movement</w:t>
+      </w:r>
+      <w:r>
+        <w:t xml:space="preserve"> </w:t>
+      </w:r>
+      <w:r>
+        <w:t xml:space="preserve">[Video]. YouTube.</w:t>
       </w:r>
     </w:p>
     <w:bookmarkEnd w:id="141"/>
-    <w:bookmarkStart w:id="142" w:name="ref-WalkerEvansMoMA"/>
+    <w:bookmarkStart w:id="142" w:name="X4431e898d182139968e3fc50e9f2730ffbbf3cf"/>
     <w:p>
       <w:pPr>
         <w:pStyle w:val="Bibliography"/>
       </w:pPr>
       <w:r>
-        <w:t xml:space="preserve">Walker</w:t>
-      </w:r>
-      <w:r>
-        <w:t xml:space="preserve"> </w:t>
-      </w:r>
-      <w:r>
-        <w:t xml:space="preserve">Evans MoMA</w:t>
-      </w:r>
-      <w:r>
-        <w:t xml:space="preserve"> </w:t>
-      </w:r>
-      <w:r>
-        <w:t xml:space="preserve">exhibit. (n.d.). In</w:t>
+        <w:t xml:space="preserve">Mike Olbinski Photography. (2017).</w:t>
       </w:r>
       <w:r>
         <w:t xml:space="preserve"> </w:t>
@@ -22097,45 +22489,13 @@
           <w:i/>
           <w:iCs/>
         </w:rPr>
-        <w:t xml:space="preserve">The Museum of Modern Art</w:t>
-      </w:r>
-      <w:r>
-        <w:t xml:space="preserve">. https://www.moma.org/collection/artists/1777.</w:t>
-      </w:r>
-    </w:p>
-    <w:bookmarkEnd w:id="142"/>
-    <w:bookmarkStart w:id="143" w:name="ref-weiss20MontagesThat"/>
-    <w:p>
-      <w:pPr>
-        <w:pStyle w:val="Bibliography"/>
-      </w:pPr>
-      <w:r>
-        <w:t xml:space="preserve">Weiss, S. R. (2015). 20 montages that might be the best part of the movie. In</w:t>
-      </w:r>
-      <w:r>
-        <w:t xml:space="preserve"> </w:t>
+        <w:t xml:space="preserve">Pursuit -</w:t>
       </w:r>
       <w:r>
         <w:rPr>
           <w:i/>
           <w:iCs/>
         </w:rPr>
-        <w:t xml:space="preserve">Refinery 29</w:t>
-      </w:r>
-      <w:r>
-        <w:t xml:space="preserve">. https://www.refinery29.com/en-us/best-movie-montages.</w:t>
-      </w:r>
-    </w:p>
-    <w:bookmarkEnd w:id="143"/>
-    <w:bookmarkStart w:id="144" w:name="ref-wolfcrowStagesPostProduction2016"/>
-    <w:p>
-      <w:pPr>
-        <w:pStyle w:val="Bibliography"/>
-      </w:pPr>
-      <w:r>
-        <w:t xml:space="preserve">Wolfcrow. (2016).</w:t>
-      </w:r>
-      <w:r>
         <w:t xml:space="preserve"> </w:t>
       </w:r>
       <w:r>
@@ -22143,32 +22503,834 @@
           <w:i/>
           <w:iCs/>
         </w:rPr>
-        <w:t xml:space="preserve">Stages of post production for filmmaking in cinema</w:t>
-      </w:r>
-      <w:r>
-        <w:t xml:space="preserve"> </w:t>
-      </w:r>
-      <w:r>
-        <w:t xml:space="preserve">[Video]. YouTube.</w:t>
-      </w:r>
-    </w:p>
-    <w:bookmarkEnd w:id="144"/>
-    <w:bookmarkStart w:id="145" w:name="ref-wolfcrow15EssentialCamera2017"/>
-    <w:p>
-      <w:pPr>
-        <w:pStyle w:val="Bibliography"/>
-      </w:pPr>
-      <w:r>
-        <w:t xml:space="preserve">Wolfcrow. (2017).</w:t>
-      </w:r>
-      <w:r>
-        <w:t xml:space="preserve"> </w:t>
+        <w:t xml:space="preserve">A 4K</w:t>
       </w:r>
       <w:r>
         <w:rPr>
           <w:i/>
           <w:iCs/>
         </w:rPr>
+        <w:t xml:space="preserve"> </w:t>
+      </w:r>
+      <w:r>
+        <w:rPr>
+          <w:i/>
+          <w:iCs/>
+        </w:rPr>
+        <w:t xml:space="preserve">storm time-lapse film</w:t>
+      </w:r>
+      <w:r>
+        <w:t xml:space="preserve"> </w:t>
+      </w:r>
+      <w:r>
+        <w:t xml:space="preserve">[Video]. YouTube.</w:t>
+      </w:r>
+    </w:p>
+    <w:bookmarkEnd w:id="142"/>
+    <w:bookmarkStart w:id="143" w:name="ref-OutlinesTreatmentsScriptments"/>
+    <w:p>
+      <w:pPr>
+        <w:pStyle w:val="Bibliography"/>
+      </w:pPr>
+      <w:r>
+        <w:t xml:space="preserve">Miyamoto, K. (n.d.). Outlines, treatments, and scriptments, oh my! In</w:t>
+      </w:r>
+      <w:r>
+        <w:t xml:space="preserve"> </w:t>
+      </w:r>
+      <w:r>
+        <w:rPr>
+          <w:i/>
+          <w:iCs/>
+        </w:rPr>
+        <w:t xml:space="preserve">Final Draft</w:t>
+      </w:r>
+      <w:r>
+        <w:t xml:space="preserve">. https://www.finaldraft.com/blog/outlines-treatments-and-scriptments.</w:t>
+      </w:r>
+    </w:p>
+    <w:bookmarkEnd w:id="143"/>
+    <w:bookmarkStart w:id="144" w:name="ref-indymogul7ThingsKnow2013"/>
+    <w:p>
+      <w:pPr>
+        <w:pStyle w:val="Bibliography"/>
+      </w:pPr>
+      <w:r>
+        <w:t xml:space="preserve">Mogul, I. (2013).</w:t>
+      </w:r>
+      <w:r>
+        <w:t xml:space="preserve"> </w:t>
+      </w:r>
+      <w:r>
+        <w:rPr>
+          <w:i/>
+          <w:iCs/>
+        </w:rPr>
+        <w:t xml:space="preserve">7 things to know about making short films! :</w:t>
+      </w:r>
+      <w:r>
+        <w:rPr>
+          <w:i/>
+          <w:iCs/>
+        </w:rPr>
+        <w:t xml:space="preserve"> </w:t>
+      </w:r>
+      <w:r>
+        <w:rPr>
+          <w:i/>
+          <w:iCs/>
+        </w:rPr>
+        <w:t xml:space="preserve">Friday</w:t>
+      </w:r>
+      <w:r>
+        <w:rPr>
+          <w:i/>
+          <w:iCs/>
+        </w:rPr>
+        <w:t xml:space="preserve"> </w:t>
+      </w:r>
+      <w:r>
+        <w:rPr>
+          <w:i/>
+          <w:iCs/>
+        </w:rPr>
+        <w:t xml:space="preserve">101</w:t>
+      </w:r>
+      <w:r>
+        <w:t xml:space="preserve"> </w:t>
+      </w:r>
+      <w:r>
+        <w:t xml:space="preserve">[Video]. YouTube.</w:t>
+      </w:r>
+    </w:p>
+    <w:bookmarkEnd w:id="144"/>
+    <w:bookmarkStart w:id="145" w:name="ref-tylermoweryHowWriteShort2019"/>
+    <w:p>
+      <w:pPr>
+        <w:pStyle w:val="Bibliography"/>
+      </w:pPr>
+      <w:r>
+        <w:t xml:space="preserve">Mowery, T. (2019).</w:t>
+      </w:r>
+      <w:r>
+        <w:t xml:space="preserve"> </w:t>
+      </w:r>
+      <w:r>
+        <w:rPr>
+          <w:i/>
+          <w:iCs/>
+        </w:rPr>
+        <w:t xml:space="preserve">How to write a short film</w:t>
+      </w:r>
+      <w:r>
+        <w:t xml:space="preserve"> </w:t>
+      </w:r>
+      <w:r>
+        <w:t xml:space="preserve">[Video]. YouTube.</w:t>
+      </w:r>
+    </w:p>
+    <w:bookmarkEnd w:id="145"/>
+    <w:bookmarkStart w:id="146" w:name="ref-on30WaysBrainstorm2019"/>
+    <w:p>
+      <w:pPr>
+        <w:pStyle w:val="Bibliography"/>
+      </w:pPr>
+      <w:r>
+        <w:t xml:space="preserve">Muehleck, C. (2019).</w:t>
+      </w:r>
+      <w:r>
+        <w:t xml:space="preserve"> </w:t>
+      </w:r>
+      <w:r>
+        <w:rPr>
+          <w:i/>
+          <w:iCs/>
+        </w:rPr>
+        <w:t xml:space="preserve">30 ways to brainstorm short film ideas you can actually produce</w:t>
+      </w:r>
+      <w:r>
+        <w:t xml:space="preserve">. https://www.studiobinder.com/blog/short-film-ideas-you-can-actually-produce/.</w:t>
+      </w:r>
+    </w:p>
+    <w:bookmarkEnd w:id="146"/>
+    <w:bookmarkStart w:id="147" w:name="ref-mattraglandHowJournalEvery2018"/>
+    <w:p>
+      <w:pPr>
+        <w:pStyle w:val="Bibliography"/>
+      </w:pPr>
+      <w:r>
+        <w:t xml:space="preserve">Ragland, M. (2018).</w:t>
+      </w:r>
+      <w:r>
+        <w:t xml:space="preserve"> </w:t>
+      </w:r>
+      <w:r>
+        <w:rPr>
+          <w:i/>
+          <w:iCs/>
+        </w:rPr>
+        <w:t xml:space="preserve">How to journal every day for increased productivity, clarity, and mental health</w:t>
+      </w:r>
+      <w:r>
+        <w:t xml:space="preserve"> </w:t>
+      </w:r>
+      <w:r>
+        <w:t xml:space="preserve">[Video]. YouTube.</w:t>
+      </w:r>
+    </w:p>
+    <w:bookmarkEnd w:id="147"/>
+    <w:bookmarkStart w:id="148" w:name="ref-reich2WhatGenre2017"/>
+    <w:p>
+      <w:pPr>
+        <w:pStyle w:val="Bibliography"/>
+      </w:pPr>
+      <w:r>
+        <w:t xml:space="preserve">Reich, J. (2017). What is genre and how is it determined?</w:t>
+      </w:r>
+      <w:r>
+        <w:t xml:space="preserve"> </w:t>
+      </w:r>
+      <w:r>
+        <w:rPr>
+          <w:i/>
+          <w:iCs/>
+        </w:rPr>
+        <w:t xml:space="preserve">Exploring Movie Construction and Production</w:t>
+      </w:r>
+      <w:r>
+        <w:t xml:space="preserve">.</w:t>
+      </w:r>
+    </w:p>
+    <w:bookmarkEnd w:id="148"/>
+    <w:bookmarkStart w:id="149" w:name="X9199323d4ed499656bf8f02a24db82642634b8e"/>
+    <w:p>
+      <w:pPr>
+        <w:pStyle w:val="Bibliography"/>
+      </w:pPr>
+      <w:r>
+        <w:t xml:space="preserve">RocketJump Film School. (2016).</w:t>
+      </w:r>
+      <w:r>
+        <w:t xml:space="preserve"> </w:t>
+      </w:r>
+      <w:r>
+        <w:rPr>
+          <w:i/>
+          <w:iCs/>
+        </w:rPr>
+        <w:t xml:space="preserve">Cuts &amp; transitions 101</w:t>
+      </w:r>
+      <w:r>
+        <w:t xml:space="preserve"> </w:t>
+      </w:r>
+      <w:r>
+        <w:t xml:space="preserve">[Video]. YouTube.</w:t>
+      </w:r>
+    </w:p>
+    <w:bookmarkEnd w:id="149"/>
+    <w:bookmarkStart w:id="150" w:name="ref-shutterstocktutorials9CutsEvery2018"/>
+    <w:p>
+      <w:pPr>
+        <w:pStyle w:val="Bibliography"/>
+      </w:pPr>
+      <w:r>
+        <w:t xml:space="preserve">Shutterstock Tutorials. (2018).</w:t>
+      </w:r>
+      <w:r>
+        <w:t xml:space="preserve"> </w:t>
+      </w:r>
+      <w:r>
+        <w:rPr>
+          <w:i/>
+          <w:iCs/>
+        </w:rPr>
+        <w:t xml:space="preserve">9 cuts every video editor should know</w:t>
+      </w:r>
+      <w:r>
+        <w:rPr>
+          <w:i/>
+          <w:iCs/>
+        </w:rPr>
+        <w:t xml:space="preserve"> </w:t>
+      </w:r>
+      <w:r>
+        <w:rPr>
+          <w:i/>
+          <w:iCs/>
+        </w:rPr>
+        <w:t xml:space="preserve"> </w:t>
+      </w:r>
+      <w:r>
+        <w:rPr>
+          <w:i/>
+          <w:iCs/>
+        </w:rPr>
+        <w:t xml:space="preserve">Filmmaking</w:t>
+      </w:r>
+      <w:r>
+        <w:rPr>
+          <w:i/>
+          <w:iCs/>
+        </w:rPr>
+        <w:t xml:space="preserve"> </w:t>
+      </w:r>
+      <w:r>
+        <w:rPr>
+          <w:i/>
+          <w:iCs/>
+        </w:rPr>
+        <w:t xml:space="preserve">tips</w:t>
+      </w:r>
+      <w:r>
+        <w:t xml:space="preserve"> </w:t>
+      </w:r>
+      <w:r>
+        <w:t xml:space="preserve">[Video]. YouTube.</w:t>
+      </w:r>
+    </w:p>
+    <w:bookmarkEnd w:id="150"/>
+    <w:bookmarkStart w:id="151" w:name="ref-Studiobinder2018"/>
+    <w:p>
+      <w:pPr>
+        <w:pStyle w:val="Bibliography"/>
+      </w:pPr>
+      <w:r>
+        <w:t xml:space="preserve">StudioBinder. (2018).</w:t>
+      </w:r>
+      <w:r>
+        <w:t xml:space="preserve"> </w:t>
+      </w:r>
+      <w:r>
+        <w:rPr>
+          <w:i/>
+          <w:iCs/>
+        </w:rPr>
+        <w:t xml:space="preserve">Film blocking tutorial — filmmaking techniques for directors:</w:t>
+      </w:r>
+      <w:r>
+        <w:rPr>
+          <w:i/>
+          <w:iCs/>
+        </w:rPr>
+        <w:t xml:space="preserve"> </w:t>
+      </w:r>
+      <w:r>
+        <w:rPr>
+          <w:i/>
+          <w:iCs/>
+        </w:rPr>
+        <w:t xml:space="preserve">Ep3</w:t>
+      </w:r>
+      <w:r>
+        <w:t xml:space="preserve"> </w:t>
+      </w:r>
+      <w:r>
+        <w:t xml:space="preserve">[Video]. YouTube.</w:t>
+      </w:r>
+    </w:p>
+    <w:bookmarkEnd w:id="151"/>
+    <w:bookmarkStart w:id="152" w:name="ref-surfacedstudioFilmMaking1012016"/>
+    <w:p>
+      <w:pPr>
+        <w:pStyle w:val="Bibliography"/>
+      </w:pPr>
+      <w:r>
+        <w:t xml:space="preserve">Surfaced Studio. (2016).</w:t>
+      </w:r>
+      <w:r>
+        <w:t xml:space="preserve"> </w:t>
+      </w:r>
+      <w:r>
+        <w:rPr>
+          <w:i/>
+          <w:iCs/>
+        </w:rPr>
+        <w:t xml:space="preserve">Film making 101 tutorial -</w:t>
+      </w:r>
+      <w:r>
+        <w:rPr>
+          <w:i/>
+          <w:iCs/>
+        </w:rPr>
+        <w:t xml:space="preserve"> </w:t>
+      </w:r>
+      <w:r>
+        <w:rPr>
+          <w:i/>
+          <w:iCs/>
+        </w:rPr>
+        <w:t xml:space="preserve">L</w:t>
+      </w:r>
+      <w:r>
+        <w:rPr>
+          <w:i/>
+          <w:iCs/>
+        </w:rPr>
+        <w:t xml:space="preserve"> </w:t>
+      </w:r>
+      <w:r>
+        <w:rPr>
+          <w:i/>
+          <w:iCs/>
+        </w:rPr>
+        <w:t xml:space="preserve">&amp;</w:t>
+      </w:r>
+      <w:r>
+        <w:rPr>
+          <w:i/>
+          <w:iCs/>
+        </w:rPr>
+        <w:t xml:space="preserve"> </w:t>
+      </w:r>
+      <w:r>
+        <w:rPr>
+          <w:i/>
+          <w:iCs/>
+        </w:rPr>
+        <w:t xml:space="preserve">J</w:t>
+      </w:r>
+      <w:r>
+        <w:rPr>
+          <w:i/>
+          <w:iCs/>
+        </w:rPr>
+        <w:t xml:space="preserve"> </w:t>
+      </w:r>
+      <w:r>
+        <w:rPr>
+          <w:i/>
+          <w:iCs/>
+        </w:rPr>
+        <w:t xml:space="preserve">cuts</w:t>
+      </w:r>
+      <w:r>
+        <w:t xml:space="preserve"> </w:t>
+      </w:r>
+      <w:r>
+        <w:t xml:space="preserve">[Video]. YouTube.</w:t>
+      </w:r>
+    </w:p>
+    <w:bookmarkEnd w:id="152"/>
+    <w:bookmarkStart w:id="153" w:name="ref-thefilmlookHowCastACTOR2018"/>
+    <w:p>
+      <w:pPr>
+        <w:pStyle w:val="Bibliography"/>
+      </w:pPr>
+      <w:r>
+        <w:t xml:space="preserve">The Film Look. (2018).</w:t>
+      </w:r>
+      <w:r>
+        <w:t xml:space="preserve"> </w:t>
+      </w:r>
+      <w:r>
+        <w:rPr>
+          <w:i/>
+          <w:iCs/>
+        </w:rPr>
+        <w:t xml:space="preserve">How to cast an actor for a no budget film</w:t>
+      </w:r>
+      <w:r>
+        <w:t xml:space="preserve"> </w:t>
+      </w:r>
+      <w:r>
+        <w:t xml:space="preserve">[Video]. YouTube.</w:t>
+      </w:r>
+    </w:p>
+    <w:bookmarkEnd w:id="153"/>
+    <w:bookmarkStart w:id="154" w:name="ref-Thefilmmakersblog2019"/>
+    <w:p>
+      <w:pPr>
+        <w:pStyle w:val="Bibliography"/>
+      </w:pPr>
+      <w:r>
+        <w:t xml:space="preserve">The Filmmaker’s Blog. (2019).</w:t>
+      </w:r>
+      <w:r>
+        <w:t xml:space="preserve"> </w:t>
+      </w:r>
+      <w:r>
+        <w:rPr>
+          <w:i/>
+          <w:iCs/>
+        </w:rPr>
+        <w:t xml:space="preserve">What is a master shot?</w:t>
+      </w:r>
+      <w:r>
+        <w:t xml:space="preserve"> </w:t>
+      </w:r>
+      <w:r>
+        <w:t xml:space="preserve">[Video]. YouTube.</w:t>
+      </w:r>
+    </w:p>
+    <w:bookmarkEnd w:id="154"/>
+    <w:bookmarkStart w:id="155" w:name="X3fa1cf828e5794034f6ff7b145b6e1e1404142a"/>
+    <w:p>
+      <w:pPr>
+        <w:pStyle w:val="Bibliography"/>
+      </w:pPr>
+      <w:r>
+        <w:t xml:space="preserve">The Frugal Filmmaker. (2013).</w:t>
+      </w:r>
+      <w:r>
+        <w:t xml:space="preserve"> </w:t>
+      </w:r>
+      <w:r>
+        <w:rPr>
+          <w:i/>
+          <w:iCs/>
+        </w:rPr>
+        <w:t xml:space="preserve">Auditioning actors</w:t>
+      </w:r>
+      <w:r>
+        <w:t xml:space="preserve"> </w:t>
+      </w:r>
+      <w:r>
+        <w:t xml:space="preserve">[Video]. YouTube.</w:t>
+      </w:r>
+    </w:p>
+    <w:bookmarkEnd w:id="155"/>
+    <w:bookmarkStart w:id="156" w:name="ref-Principlesofdesign"/>
+    <w:p>
+      <w:pPr>
+        <w:pStyle w:val="Bibliography"/>
+      </w:pPr>
+      <w:r>
+        <w:t xml:space="preserve">The J. Paul Getty Musuem. (2011).</w:t>
+      </w:r>
+      <w:r>
+        <w:t xml:space="preserve"> </w:t>
+      </w:r>
+      <w:r>
+        <w:rPr>
+          <w:i/>
+          <w:iCs/>
+        </w:rPr>
+        <w:t xml:space="preserve">Principles of design</w:t>
+      </w:r>
+      <w:r>
+        <w:t xml:space="preserve">.</w:t>
+      </w:r>
+    </w:p>
+    <w:bookmarkEnd w:id="156"/>
+    <w:bookmarkStart w:id="157" w:name="ref-theslantedlens8CinematicCamera2018"/>
+    <w:p>
+      <w:pPr>
+        <w:pStyle w:val="Bibliography"/>
+      </w:pPr>
+      <w:r>
+        <w:t xml:space="preserve">The Slanted Lens. (2018).</w:t>
+      </w:r>
+      <w:r>
+        <w:t xml:space="preserve"> </w:t>
+      </w:r>
+      <w:r>
+        <w:rPr>
+          <w:i/>
+          <w:iCs/>
+        </w:rPr>
+        <w:t xml:space="preserve">8 cinematic camera moves for video</w:t>
+      </w:r>
+      <w:r>
+        <w:t xml:space="preserve"> </w:t>
+      </w:r>
+      <w:r>
+        <w:t xml:space="preserve">[Video]. YouTube.</w:t>
+      </w:r>
+    </w:p>
+    <w:bookmarkEnd w:id="157"/>
+    <w:bookmarkStart w:id="158" w:name="ref-TalentCode"/>
+    <w:p>
+      <w:pPr>
+        <w:pStyle w:val="Bibliography"/>
+      </w:pPr>
+      <w:r>
+        <w:t xml:space="preserve">The talent code. (n.d.). In</w:t>
+      </w:r>
+      <w:r>
+        <w:t xml:space="preserve"> </w:t>
+      </w:r>
+      <w:r>
+        <w:rPr>
+          <w:i/>
+          <w:iCs/>
+        </w:rPr>
+        <w:t xml:space="preserve">Daniel Coyle</w:t>
+      </w:r>
+      <w:r>
+        <w:t xml:space="preserve">.</w:t>
+      </w:r>
+    </w:p>
+    <w:bookmarkEnd w:id="158"/>
+    <w:bookmarkStart w:id="159" w:name="ref-TindellMatchcuts2016"/>
+    <w:p>
+      <w:pPr>
+        <w:pStyle w:val="Bibliography"/>
+      </w:pPr>
+      <w:r>
+        <w:t xml:space="preserve">Tindell, J. (2016).</w:t>
+      </w:r>
+      <w:r>
+        <w:t xml:space="preserve"> </w:t>
+      </w:r>
+      <w:r>
+        <w:rPr>
+          <w:i/>
+          <w:iCs/>
+        </w:rPr>
+        <w:t xml:space="preserve">Match cuts in film editing</w:t>
+      </w:r>
+      <w:r>
+        <w:t xml:space="preserve"> </w:t>
+      </w:r>
+      <w:r>
+        <w:t xml:space="preserve">[Video]. YouTube.</w:t>
+      </w:r>
+    </w:p>
+    <w:bookmarkEnd w:id="159"/>
+    <w:bookmarkStart w:id="160" w:name="ref-VankevichDigitalFilmmaking"/>
+    <w:p>
+      <w:pPr>
+        <w:pStyle w:val="Bibliography"/>
+      </w:pPr>
+      <w:r>
+        <w:t xml:space="preserve">Vankevich, N. (n.d.).</w:t>
+      </w:r>
+      <w:r>
+        <w:t xml:space="preserve"> </w:t>
+      </w:r>
+      <w:r>
+        <w:rPr>
+          <w:i/>
+          <w:iCs/>
+        </w:rPr>
+        <w:t xml:space="preserve">Digital filmmaking:</w:t>
+      </w:r>
+      <w:r>
+        <w:rPr>
+          <w:i/>
+          <w:iCs/>
+        </w:rPr>
+        <w:t xml:space="preserve"> </w:t>
+      </w:r>
+      <w:r>
+        <w:rPr>
+          <w:i/>
+          <w:iCs/>
+        </w:rPr>
+        <w:t xml:space="preserve">A</w:t>
+      </w:r>
+      <w:r>
+        <w:rPr>
+          <w:i/>
+          <w:iCs/>
+        </w:rPr>
+        <w:t xml:space="preserve"> </w:t>
+      </w:r>
+      <w:r>
+        <w:rPr>
+          <w:i/>
+          <w:iCs/>
+        </w:rPr>
+        <w:t xml:space="preserve">beginner’s guide to mastering the craft</w:t>
+      </w:r>
+      <w:r>
+        <w:t xml:space="preserve">.</w:t>
+      </w:r>
+    </w:p>
+    <w:bookmarkEnd w:id="160"/>
+    <w:bookmarkStart w:id="161" w:name="ref-Videomaker2013"/>
+    <w:p>
+      <w:pPr>
+        <w:pStyle w:val="Bibliography"/>
+      </w:pPr>
+      <w:r>
+        <w:t xml:space="preserve">Videomaker. (2013).</w:t>
+      </w:r>
+      <w:r>
+        <w:t xml:space="preserve"> </w:t>
+      </w:r>
+      <w:r>
+        <w:rPr>
+          <w:i/>
+          <w:iCs/>
+        </w:rPr>
+        <w:t xml:space="preserve">Breaking down the 180-degree rule</w:t>
+      </w:r>
+      <w:r>
+        <w:t xml:space="preserve"> </w:t>
+      </w:r>
+      <w:r>
+        <w:t xml:space="preserve">[Video].</w:t>
+      </w:r>
+    </w:p>
+    <w:bookmarkEnd w:id="161"/>
+    <w:bookmarkStart w:id="162" w:name="ref-11ThoughtsIntroduction"/>
+    <w:p>
+      <w:pPr>
+        <w:pStyle w:val="Bibliography"/>
+      </w:pPr>
+      <w:r>
+        <w:t xml:space="preserve">Vorenkamp, T. (2016). 11 thoughts:</w:t>
+      </w:r>
+      <w:r>
+        <w:t xml:space="preserve"> </w:t>
+      </w:r>
+      <w:r>
+        <w:t xml:space="preserve">An</w:t>
+      </w:r>
+      <w:r>
+        <w:t xml:space="preserve"> </w:t>
+      </w:r>
+      <w:r>
+        <w:t xml:space="preserve">introduction to photographic composition. In</w:t>
+      </w:r>
+      <w:r>
+        <w:t xml:space="preserve"> </w:t>
+      </w:r>
+      <w:r>
+        <w:rPr>
+          <w:i/>
+          <w:iCs/>
+        </w:rPr>
+        <w:t xml:space="preserve">Bhphotovideo</w:t>
+      </w:r>
+      <w:r>
+        <w:t xml:space="preserve">. https://www.bhphotovideo.com/explora/photography/tips-and-solutions/11-thoughts-an-introduction-to-photographic-composition.</w:t>
+      </w:r>
+    </w:p>
+    <w:bookmarkEnd w:id="162"/>
+    <w:bookmarkStart w:id="163" w:name="ref-WalkerEvansMoMA"/>
+    <w:p>
+      <w:pPr>
+        <w:pStyle w:val="Bibliography"/>
+      </w:pPr>
+      <w:r>
+        <w:t xml:space="preserve">Walker</w:t>
+      </w:r>
+      <w:r>
+        <w:t xml:space="preserve"> </w:t>
+      </w:r>
+      <w:r>
+        <w:t xml:space="preserve">Evans MoMA</w:t>
+      </w:r>
+      <w:r>
+        <w:t xml:space="preserve"> </w:t>
+      </w:r>
+      <w:r>
+        <w:t xml:space="preserve">exhibit. (n.d.). In</w:t>
+      </w:r>
+      <w:r>
+        <w:t xml:space="preserve"> </w:t>
+      </w:r>
+      <w:r>
+        <w:rPr>
+          <w:i/>
+          <w:iCs/>
+        </w:rPr>
+        <w:t xml:space="preserve">The Museum of Modern Art</w:t>
+      </w:r>
+      <w:r>
+        <w:t xml:space="preserve">. https://www.moma.org/collection/artists/1777.</w:t>
+      </w:r>
+    </w:p>
+    <w:bookmarkEnd w:id="163"/>
+    <w:bookmarkStart w:id="164" w:name="ref-weiss20MontagesThat"/>
+    <w:p>
+      <w:pPr>
+        <w:pStyle w:val="Bibliography"/>
+      </w:pPr>
+      <w:r>
+        <w:t xml:space="preserve">Weiss, S. R. (2015). 20 montages that might be the best part of the movie. In</w:t>
+      </w:r>
+      <w:r>
+        <w:t xml:space="preserve"> </w:t>
+      </w:r>
+      <w:r>
+        <w:rPr>
+          <w:i/>
+          <w:iCs/>
+        </w:rPr>
+        <w:t xml:space="preserve">Refinery 29</w:t>
+      </w:r>
+      <w:r>
+        <w:t xml:space="preserve">. https://www.refinery29.com/en-us/best-movie-montages.</w:t>
+      </w:r>
+    </w:p>
+    <w:bookmarkEnd w:id="164"/>
+    <w:bookmarkStart w:id="165" w:name="ref-adminWhatTypeShort2012"/>
+    <w:p>
+      <w:pPr>
+        <w:pStyle w:val="Bibliography"/>
+      </w:pPr>
+      <w:r>
+        <w:t xml:space="preserve">What type of short films do we prefer on</w:t>
+      </w:r>
+      <w:r>
+        <w:t xml:space="preserve"> </w:t>
+      </w:r>
+      <w:r>
+        <w:t xml:space="preserve">FilmShortage</w:t>
+      </w:r>
+      <w:r>
+        <w:t xml:space="preserve">? (2012). In</w:t>
+      </w:r>
+      <w:r>
+        <w:t xml:space="preserve"> </w:t>
+      </w:r>
+      <w:r>
+        <w:rPr>
+          <w:i/>
+          <w:iCs/>
+        </w:rPr>
+        <w:t xml:space="preserve">Film Shortage</w:t>
+      </w:r>
+      <w:r>
+        <w:t xml:space="preserve">. https://filmshortage.com/what-we-like/.</w:t>
+      </w:r>
+    </w:p>
+    <w:bookmarkEnd w:id="165"/>
+    <w:bookmarkStart w:id="166" w:name="ref-wolfcrowStagesPostProduction2016"/>
+    <w:p>
+      <w:pPr>
+        <w:pStyle w:val="Bibliography"/>
+      </w:pPr>
+      <w:r>
+        <w:t xml:space="preserve">Wolfcrow. (2016).</w:t>
+      </w:r>
+      <w:r>
+        <w:t xml:space="preserve"> </w:t>
+      </w:r>
+      <w:r>
+        <w:rPr>
+          <w:i/>
+          <w:iCs/>
+        </w:rPr>
+        <w:t xml:space="preserve">Stages of post production for filmmaking in cinema</w:t>
+      </w:r>
+      <w:r>
+        <w:t xml:space="preserve"> </w:t>
+      </w:r>
+      <w:r>
+        <w:t xml:space="preserve">[Video]. YouTube.</w:t>
+      </w:r>
+    </w:p>
+    <w:bookmarkEnd w:id="166"/>
+    <w:bookmarkStart w:id="167" w:name="ref-wolfcrow15EssentialCamera2017"/>
+    <w:p>
+      <w:pPr>
+        <w:pStyle w:val="Bibliography"/>
+      </w:pPr>
+      <w:r>
+        <w:t xml:space="preserve">Wolfcrow. (2017).</w:t>
+      </w:r>
+      <w:r>
+        <w:t xml:space="preserve"> </w:t>
+      </w:r>
+      <w:r>
+        <w:rPr>
+          <w:i/>
+          <w:iCs/>
+        </w:rPr>
         <w:t xml:space="preserve">15 essential camera shots, angles and movements in filmmaking</w:t>
       </w:r>
       <w:r>
@@ -22178,8 +23340,8 @@
         <w:t xml:space="preserve">[Video]. YouTube.</w:t>
       </w:r>
     </w:p>
-    <w:bookmarkEnd w:id="145"/>
-    <w:bookmarkEnd w:id="146"/>
+    <w:bookmarkEnd w:id="167"/>
+    <w:bookmarkEnd w:id="168"/>
     <w:sectPr>
       <w:footnotePr>
         <w:numRestart w:val="eachSect"/>

</xml_diff>

<commit_message>
fixed Incorrect link Fixes TWUOnline/mcom221-q#8
</commit_message>
<xml_diff>
--- a/docs/MCOM-221.docx
+++ b/docs/MCOM-221.docx
@@ -23,7 +23,7 @@
         <w:pStyle w:val="Date"/>
       </w:pPr>
       <w:r>
-        <w:t xml:space="preserve">Mar 18, 2026</w:t>
+        <w:t xml:space="preserve">May 4, 2026</w:t>
       </w:r>
     </w:p>
     <w:p>
@@ -740,18 +740,7 @@
         <w:t xml:space="preserve"> </w:t>
       </w:r>
       <w:r>
-        <w:t xml:space="preserve">(</w:t>
-      </w:r>
-      <w:hyperlink w:anchor="ref-VankevichDigitalFilmmaking">
-        <w:r>
-          <w:rPr>
-            <w:rStyle w:val="Hyperlink"/>
-          </w:rPr>
-          <w:t xml:space="preserve">n.d.</w:t>
-        </w:r>
-      </w:hyperlink>
-      <w:r>
-        <w:t xml:space="preserve">)</w:t>
+        <w:t xml:space="preserve">(n.d.)</w:t>
       </w:r>
       <w:r>
         <w:t xml:space="preserve"> </w:t>
@@ -1084,18 +1073,7 @@
         <w:t xml:space="preserve"> </w:t>
       </w:r>
       <w:r>
-        <w:t xml:space="preserve">(</w:t>
-      </w:r>
-      <w:hyperlink w:anchor="ref-mattraglandHowJournalEvery2018">
-        <w:r>
-          <w:rPr>
-            <w:rStyle w:val="Hyperlink"/>
-          </w:rPr>
-          <w:t xml:space="preserve">Ragland, 2018</w:t>
-        </w:r>
-      </w:hyperlink>
-      <w:r>
-        <w:t xml:space="preserve">)</w:t>
+        <w:t xml:space="preserve">(Ragland, 2018)</w:t>
       </w:r>
       <w:r>
         <w:t xml:space="preserve"> </w:t>
@@ -1494,28 +1472,14 @@
       <w:r>
         <w:t xml:space="preserve">(</w:t>
       </w:r>
-      <w:hyperlink w:anchor="ref-TalentCode">
-        <w:r>
-          <w:rPr>
-            <w:rStyle w:val="Hyperlink"/>
-          </w:rPr>
-          <w:t xml:space="preserve">“The Talent Code,”</w:t>
-        </w:r>
-        <w:r>
-          <w:rPr>
-            <w:rStyle w:val="Hyperlink"/>
-          </w:rPr>
-          <w:t xml:space="preserve"> </w:t>
-        </w:r>
-        <w:r>
-          <w:rPr>
-            <w:rStyle w:val="Hyperlink"/>
-          </w:rPr>
-          <w:t xml:space="preserve">n.d.</w:t>
-        </w:r>
-      </w:hyperlink>
-      <w:r>
-        <w:t xml:space="preserve">)</w:t>
+      <w:r>
+        <w:t xml:space="preserve">“The Talent Code,”</w:t>
+      </w:r>
+      <w:r>
+        <w:t xml:space="preserve"> </w:t>
+      </w:r>
+      <w:r>
+        <w:t xml:space="preserve">n.d.)</w:t>
       </w:r>
       <w:r>
         <w:t xml:space="preserve">.</w:t>
@@ -1645,18 +1609,7 @@
         <w:t xml:space="preserve"> </w:t>
       </w:r>
       <w:r>
-        <w:t xml:space="preserve">(</w:t>
-      </w:r>
-      <w:hyperlink w:anchor="ref-keiserHowGrowProfessionally2018">
-        <w:r>
-          <w:rPr>
-            <w:rStyle w:val="Hyperlink"/>
-          </w:rPr>
-          <w:t xml:space="preserve">Keiser, 2018</w:t>
-        </w:r>
-      </w:hyperlink>
-      <w:r>
-        <w:t xml:space="preserve">)</w:t>
+        <w:t xml:space="preserve">(Keiser, 2018)</w:t>
       </w:r>
     </w:p>
     <w:p>
@@ -3188,18 +3141,7 @@
         <w:t xml:space="preserve"> </w:t>
       </w:r>
       <w:r>
-        <w:t xml:space="preserve">(</w:t>
-      </w:r>
-      <w:hyperlink w:anchor="ref-d4dariousShootingFilmSTART2018">
-        <w:r>
-          <w:rPr>
-            <w:rStyle w:val="Hyperlink"/>
-          </w:rPr>
-          <w:t xml:space="preserve">D4Darious, 2018</w:t>
-        </w:r>
-      </w:hyperlink>
-      <w:r>
-        <w:t xml:space="preserve">)</w:t>
+        <w:t xml:space="preserve">(D4Darious, 2018)</w:t>
       </w:r>
     </w:p>
     <w:p>
@@ -3772,18 +3714,7 @@
         <w:t xml:space="preserve"> </w:t>
       </w:r>
       <w:r>
-        <w:t xml:space="preserve">(</w:t>
-      </w:r>
-      <w:hyperlink w:anchor="X660ccfd3ee355b37f2e4b9d9bd588d670e5fb1a">
-        <w:r>
-          <w:rPr>
-            <w:rStyle w:val="Hyperlink"/>
-          </w:rPr>
-          <w:t xml:space="preserve">CrashCourse, 2017</w:t>
-        </w:r>
-      </w:hyperlink>
-      <w:r>
-        <w:t xml:space="preserve">)</w:t>
+        <w:t xml:space="preserve">(CrashCourse, 2017)</w:t>
       </w:r>
     </w:p>
     <w:p>
@@ -4815,18 +4746,7 @@
         <w:t xml:space="preserve"> </w:t>
       </w:r>
       <w:r>
-        <w:t xml:space="preserve">(</w:t>
-      </w:r>
-      <w:hyperlink w:anchor="ref-VankevichDigitalFilmmaking">
-        <w:r>
-          <w:rPr>
-            <w:rStyle w:val="Hyperlink"/>
-          </w:rPr>
-          <w:t xml:space="preserve">n.d.</w:t>
-        </w:r>
-      </w:hyperlink>
-      <w:r>
-        <w:t xml:space="preserve">)</w:t>
+        <w:t xml:space="preserve">(n.d.)</w:t>
       </w:r>
       <w:r>
         <w:t xml:space="preserve"> </w:t>
@@ -5252,18 +5172,7 @@
         <w:t xml:space="preserve"> </w:t>
       </w:r>
       <w:r>
-        <w:t xml:space="preserve">(</w:t>
-      </w:r>
-      <w:hyperlink w:anchor="ref-11ThoughtsIntroduction">
-        <w:r>
-          <w:rPr>
-            <w:rStyle w:val="Hyperlink"/>
-          </w:rPr>
-          <w:t xml:space="preserve">2016</w:t>
-        </w:r>
-      </w:hyperlink>
-      <w:r>
-        <w:t xml:space="preserve">)</w:t>
+        <w:t xml:space="preserve">(2016)</w:t>
       </w:r>
       <w:r>
         <w:t xml:space="preserve">.</w:t>
@@ -5432,18 +5341,7 @@
         <w:t xml:space="preserve"> </w:t>
       </w:r>
       <w:r>
-        <w:t xml:space="preserve">(</w:t>
-      </w:r>
-      <w:hyperlink w:anchor="ref-Carroll28CompositionTechniques2023">
-        <w:r>
-          <w:rPr>
-            <w:rStyle w:val="Hyperlink"/>
-          </w:rPr>
-          <w:t xml:space="preserve">Carroll, 2023</w:t>
-        </w:r>
-      </w:hyperlink>
-      <w:r>
-        <w:t xml:space="preserve">)</w:t>
+        <w:t xml:space="preserve">(Carroll, 2023)</w:t>
       </w:r>
       <w:r>
         <w:t xml:space="preserve">, and</w:t>
@@ -5465,18 +5363,7 @@
         <w:t xml:space="preserve"> </w:t>
       </w:r>
       <w:r>
-        <w:t xml:space="preserve">(</w:t>
-      </w:r>
-      <w:hyperlink w:anchor="ref-Principlesofdesign">
-        <w:r>
-          <w:rPr>
-            <w:rStyle w:val="Hyperlink"/>
-          </w:rPr>
-          <w:t xml:space="preserve">The J. Paul Getty Musuem, 2011</w:t>
-        </w:r>
-      </w:hyperlink>
-      <w:r>
-        <w:t xml:space="preserve">)</w:t>
+        <w:t xml:space="preserve">(The J. Paul Getty Musuem, 2011)</w:t>
       </w:r>
       <w:r>
         <w:t xml:space="preserve">.</w:t>
@@ -5628,18 +5515,7 @@
         <w:t xml:space="preserve"> </w:t>
       </w:r>
       <w:r>
-        <w:t xml:space="preserve">(</w:t>
-      </w:r>
-      <w:hyperlink w:anchor="ref-WalkerEvansMoMA">
-        <w:r>
-          <w:rPr>
-            <w:rStyle w:val="Hyperlink"/>
-          </w:rPr>
-          <w:t xml:space="preserve">n.d.</w:t>
-        </w:r>
-      </w:hyperlink>
-      <w:r>
-        <w:t xml:space="preserve">)</w:t>
+        <w:t xml:space="preserve">(n.d.)</w:t>
       </w:r>
     </w:p>
     <w:p>
@@ -5668,18 +5544,7 @@
         <w:t xml:space="preserve"> </w:t>
       </w:r>
       <w:r>
-        <w:t xml:space="preserve">(</w:t>
-      </w:r>
-      <w:hyperlink w:anchor="ref-HistoryPlaceDorothea">
-        <w:r>
-          <w:rPr>
-            <w:rStyle w:val="Hyperlink"/>
-          </w:rPr>
-          <w:t xml:space="preserve">n.d.</w:t>
-        </w:r>
-      </w:hyperlink>
-      <w:r>
-        <w:t xml:space="preserve">)</w:t>
+        <w:t xml:space="preserve">(n.d.)</w:t>
       </w:r>
     </w:p>
     <w:p>
@@ -5702,18 +5567,7 @@
         <w:t xml:space="preserve"> </w:t>
       </w:r>
       <w:r>
-        <w:t xml:space="preserve">(</w:t>
-      </w:r>
-      <w:hyperlink w:anchor="ref-FamousPhotographersPose2015">
-        <w:r>
-          <w:rPr>
-            <w:rStyle w:val="Hyperlink"/>
-          </w:rPr>
-          <w:t xml:space="preserve">2015</w:t>
-        </w:r>
-      </w:hyperlink>
-      <w:r>
-        <w:t xml:space="preserve">)</w:t>
+        <w:t xml:space="preserve">(2015)</w:t>
       </w:r>
     </w:p>
     <w:p>
@@ -6772,18 +6626,7 @@
         <w:t xml:space="preserve"> </w:t>
       </w:r>
       <w:r>
-        <w:t xml:space="preserve">(</w:t>
-      </w:r>
-      <w:hyperlink w:anchor="ref-cinefix5BrilliantMoments2017">
-        <w:r>
-          <w:rPr>
-            <w:rStyle w:val="Hyperlink"/>
-          </w:rPr>
-          <w:t xml:space="preserve">CineFix, 2017</w:t>
-        </w:r>
-      </w:hyperlink>
-      <w:r>
-        <w:t xml:space="preserve">)</w:t>
+        <w:t xml:space="preserve">(CineFix, 2017)</w:t>
       </w:r>
       <w:r>
         <w:t xml:space="preserve"> </w:t>
@@ -6999,18 +6842,7 @@
         <w:t xml:space="preserve"> </w:t>
       </w:r>
       <w:r>
-        <w:t xml:space="preserve">(</w:t>
-      </w:r>
-      <w:hyperlink w:anchor="ref-theslantedlens8CinematicCamera2018">
-        <w:r>
-          <w:rPr>
-            <w:rStyle w:val="Hyperlink"/>
-          </w:rPr>
-          <w:t xml:space="preserve">The Slanted Lens, 2018</w:t>
-        </w:r>
-      </w:hyperlink>
-      <w:r>
-        <w:t xml:space="preserve">)</w:t>
+        <w:t xml:space="preserve">(The Slanted Lens, 2018)</w:t>
       </w:r>
       <w:r>
         <w:t xml:space="preserve"> </w:t>
@@ -7803,18 +7635,7 @@
         <w:t xml:space="preserve"> </w:t>
       </w:r>
       <w:r>
-        <w:t xml:space="preserve">(</w:t>
-      </w:r>
-      <w:hyperlink w:anchor="ref-FILMTERMGLOSSARY">
-        <w:r>
-          <w:rPr>
-            <w:rStyle w:val="Hyperlink"/>
-          </w:rPr>
-          <w:t xml:space="preserve">Brooklyn College Film Department, n.d.</w:t>
-        </w:r>
-      </w:hyperlink>
-      <w:r>
-        <w:t xml:space="preserve">)</w:t>
+        <w:t xml:space="preserve">(Brooklyn College Film Department, n.d.)</w:t>
       </w:r>
       <w:r>
         <w:t xml:space="preserve">. Continue to read and study the one you like throughout this course and it will help you grow your film vocabulary and your understanding of the many components and processes involved in filmmaking. Set a goal to learn 5 new terms or concepts each day.</w:t>
@@ -8198,18 +8019,7 @@
         <w:t xml:space="preserve"> </w:t>
       </w:r>
       <w:r>
-        <w:t xml:space="preserve">(</w:t>
-      </w:r>
-      <w:hyperlink w:anchor="X101f762b79795529ab4fa800f2cc5614c63733f">
-        <w:r>
-          <w:rPr>
-            <w:rStyle w:val="Hyperlink"/>
-          </w:rPr>
-          <w:t xml:space="preserve">ManWithNoName, 2016</w:t>
-        </w:r>
-      </w:hyperlink>
-      <w:r>
-        <w:t xml:space="preserve">)</w:t>
+        <w:t xml:space="preserve">(ManWithNoName, 2016)</w:t>
       </w:r>
       <w:r>
         <w:t xml:space="preserve"> </w:t>
@@ -8258,18 +8068,7 @@
         <w:t xml:space="preserve"> </w:t>
       </w:r>
       <w:r>
-        <w:t xml:space="preserve">(</w:t>
-      </w:r>
-      <w:hyperlink w:anchor="ref-wolfcrow15EssentialCamera2017">
-        <w:r>
-          <w:rPr>
-            <w:rStyle w:val="Hyperlink"/>
-          </w:rPr>
-          <w:t xml:space="preserve">Wolfcrow, 2017</w:t>
-        </w:r>
-      </w:hyperlink>
-      <w:r>
-        <w:t xml:space="preserve">)</w:t>
+        <w:t xml:space="preserve">(Wolfcrow, 2017)</w:t>
       </w:r>
       <w:r>
         <w:t xml:space="preserve"> </w:t>
@@ -8576,18 +8375,7 @@
         <w:t xml:space="preserve"> </w:t>
       </w:r>
       <w:r>
-        <w:t xml:space="preserve">(</w:t>
-      </w:r>
-      <w:hyperlink w:anchor="ref-Davenport21WaysDevelop2023">
-        <w:r>
-          <w:rPr>
-            <w:rStyle w:val="Hyperlink"/>
-          </w:rPr>
-          <w:t xml:space="preserve">Davenport, 2023</w:t>
-        </w:r>
-      </w:hyperlink>
-      <w:r>
-        <w:t xml:space="preserve">)</w:t>
+        <w:t xml:space="preserve">(Davenport, 2023)</w:t>
       </w:r>
     </w:p>
     <w:p>
@@ -8886,18 +8674,7 @@
         <w:t xml:space="preserve"> </w:t>
       </w:r>
       <w:r>
-        <w:t xml:space="preserve">(</w:t>
-      </w:r>
-      <w:hyperlink w:anchor="ref-17LessonsHenri2014">
-        <w:r>
-          <w:rPr>
-            <w:rStyle w:val="Hyperlink"/>
-          </w:rPr>
-          <w:t xml:space="preserve">Kim, 2014</w:t>
-        </w:r>
-      </w:hyperlink>
-      <w:r>
-        <w:t xml:space="preserve">)</w:t>
+        <w:t xml:space="preserve">(Kim, 2014)</w:t>
       </w:r>
     </w:p>
     <w:p>
@@ -9687,18 +9464,7 @@
         <w:t xml:space="preserve"> </w:t>
       </w:r>
       <w:r>
-        <w:t xml:space="preserve">(</w:t>
-      </w:r>
-      <w:hyperlink w:anchor="ref-Filmriots2017">
-        <w:r>
-          <w:rPr>
-            <w:rStyle w:val="Hyperlink"/>
-          </w:rPr>
-          <w:t xml:space="preserve">Film Riot, 2017</w:t>
-        </w:r>
-      </w:hyperlink>
-      <w:r>
-        <w:t xml:space="preserve">)</w:t>
+        <w:t xml:space="preserve">(Film Riot, 2017)</w:t>
       </w:r>
       <w:r>
         <w:t xml:space="preserve"> </w:t>
@@ -10025,18 +9791,7 @@
         <w:t xml:space="preserve"> </w:t>
       </w:r>
       <w:r>
-        <w:t xml:space="preserve">(</w:t>
-      </w:r>
-      <w:hyperlink w:anchor="ref-on30WaysBrainstorm2019">
-        <w:r>
-          <w:rPr>
-            <w:rStyle w:val="Hyperlink"/>
-          </w:rPr>
-          <w:t xml:space="preserve">Muehleck, 2019</w:t>
-        </w:r>
-      </w:hyperlink>
-      <w:r>
-        <w:t xml:space="preserve">)</w:t>
+        <w:t xml:space="preserve">(Muehleck, 2019)</w:t>
       </w:r>
     </w:p>
     <w:p>
@@ -10059,18 +9814,7 @@
         <w:t xml:space="preserve"> </w:t>
       </w:r>
       <w:r>
-        <w:t xml:space="preserve">(</w:t>
-      </w:r>
-      <w:hyperlink w:anchor="ref-grove19GreatWays2015">
-        <w:r>
-          <w:rPr>
-            <w:rStyle w:val="Hyperlink"/>
-          </w:rPr>
-          <w:t xml:space="preserve">Grove, 2015</w:t>
-        </w:r>
-      </w:hyperlink>
-      <w:r>
-        <w:t xml:space="preserve">)</w:t>
+        <w:t xml:space="preserve">(Grove, 2015)</w:t>
       </w:r>
     </w:p>
     <w:p>
@@ -10857,18 +10601,7 @@
         <w:t xml:space="preserve"> </w:t>
       </w:r>
       <w:r>
-        <w:t xml:space="preserve">(</w:t>
-      </w:r>
-      <w:hyperlink w:anchor="ref-iankillickEyelineMatch2014">
-        <w:r>
-          <w:rPr>
-            <w:rStyle w:val="Hyperlink"/>
-          </w:rPr>
-          <w:t xml:space="preserve">Killick, 2014b</w:t>
-        </w:r>
-      </w:hyperlink>
-      <w:r>
-        <w:t xml:space="preserve">)</w:t>
+        <w:t xml:space="preserve">(Killick, 2014b)</w:t>
       </w:r>
       <w:r>
         <w:t xml:space="preserve"> </w:t>
@@ -10917,18 +10650,7 @@
         <w:t xml:space="preserve"> </w:t>
       </w:r>
       <w:r>
-        <w:t xml:space="preserve">(</w:t>
-      </w:r>
-      <w:hyperlink w:anchor="ref-Gvfstudio2013">
-        <w:r>
-          <w:rPr>
-            <w:rStyle w:val="Hyperlink"/>
-          </w:rPr>
-          <w:t xml:space="preserve">Gvfstudio, 2013</w:t>
-        </w:r>
-      </w:hyperlink>
-      <w:r>
-        <w:t xml:space="preserve">)</w:t>
+        <w:t xml:space="preserve">(Gvfstudio, 2013)</w:t>
       </w:r>
       <w:r>
         <w:t xml:space="preserve"> </w:t>
@@ -12034,18 +11756,7 @@
         <w:t xml:space="preserve"> </w:t>
       </w:r>
       <w:r>
-        <w:t xml:space="preserve">(</w:t>
-      </w:r>
-      <w:hyperlink w:anchor="ref-wolfcrowStagesPostProduction2016">
-        <w:r>
-          <w:rPr>
-            <w:rStyle w:val="Hyperlink"/>
-          </w:rPr>
-          <w:t xml:space="preserve">Wolfcrow, 2016</w:t>
-        </w:r>
-      </w:hyperlink>
-      <w:r>
-        <w:t xml:space="preserve">)</w:t>
+        <w:t xml:space="preserve">(Wolfcrow, 2016)</w:t>
       </w:r>
       <w:r>
         <w:t xml:space="preserve"> </w:t>
@@ -12184,18 +11895,7 @@
         <w:t xml:space="preserve"> </w:t>
       </w:r>
       <w:r>
-        <w:t xml:space="preserve">(</w:t>
-      </w:r>
-      <w:hyperlink w:anchor="ref-weiss20MontagesThat">
-        <w:r>
-          <w:rPr>
-            <w:rStyle w:val="Hyperlink"/>
-          </w:rPr>
-          <w:t xml:space="preserve">Weiss, 2015</w:t>
-        </w:r>
-      </w:hyperlink>
-      <w:r>
-        <w:t xml:space="preserve">)</w:t>
+        <w:t xml:space="preserve">(Weiss, 2015)</w:t>
       </w:r>
     </w:p>
     <w:p>
@@ -12352,18 +12052,7 @@
         <w:t xml:space="preserve"> </w:t>
       </w:r>
       <w:r>
-        <w:t xml:space="preserve">(</w:t>
-      </w:r>
-      <w:hyperlink w:anchor="ref-surfacedstudioFilmMaking1012016">
-        <w:r>
-          <w:rPr>
-            <w:rStyle w:val="Hyperlink"/>
-          </w:rPr>
-          <w:t xml:space="preserve">Surfaced Studio, 2016</w:t>
-        </w:r>
-      </w:hyperlink>
-      <w:r>
-        <w:t xml:space="preserve">)</w:t>
+        <w:t xml:space="preserve">(Surfaced Studio, 2016)</w:t>
       </w:r>
       <w:r>
         <w:t xml:space="preserve"> </w:t>
@@ -12470,18 +12159,7 @@
         <w:t xml:space="preserve"> </w:t>
       </w:r>
       <w:r>
-        <w:t xml:space="preserve">(</w:t>
-      </w:r>
-      <w:hyperlink w:anchor="ref-shutterstocktutorials9CutsEvery2018">
-        <w:r>
-          <w:rPr>
-            <w:rStyle w:val="Hyperlink"/>
-          </w:rPr>
-          <w:t xml:space="preserve">Shutterstock Tutorials, 2018</w:t>
-        </w:r>
-      </w:hyperlink>
-      <w:r>
-        <w:t xml:space="preserve">)</w:t>
+        <w:t xml:space="preserve">(Shutterstock Tutorials, 2018)</w:t>
       </w:r>
       <w:r>
         <w:t xml:space="preserve"> </w:t>
@@ -12530,18 +12208,7 @@
         <w:t xml:space="preserve"> </w:t>
       </w:r>
       <w:r>
-        <w:t xml:space="preserve">(</w:t>
-      </w:r>
-      <w:hyperlink w:anchor="X9199323d4ed499656bf8f02a24db82642634b8e">
-        <w:r>
-          <w:rPr>
-            <w:rStyle w:val="Hyperlink"/>
-          </w:rPr>
-          <w:t xml:space="preserve">RocketJump Film School, 2016</w:t>
-        </w:r>
-      </w:hyperlink>
-      <w:r>
-        <w:t xml:space="preserve">)</w:t>
+        <w:t xml:space="preserve">(RocketJump Film School, 2016)</w:t>
       </w:r>
     </w:p>
     <w:p>
@@ -12553,7 +12220,7 @@
           <w:rPr>
             <w:rStyle w:val="Hyperlink"/>
           </w:rPr>
-          <w:t xml:space="preserve">https://www.youtube-nocookie.com/embed/OAH0MoAv2CI?si=nUtixWWane1Ryrxl</w:t>
+          <w:t xml:space="preserve">https://www.youtube-nocookie.com/embed/OAH0MoAv2CI?si=awfJvhh6OwRp3xfl</w:t>
         </w:r>
       </w:hyperlink>
     </w:p>
@@ -12586,18 +12253,7 @@
         <w:t xml:space="preserve"> </w:t>
       </w:r>
       <w:r>
-        <w:t xml:space="preserve">(</w:t>
-      </w:r>
-      <w:hyperlink w:anchor="X4431e898d182139968e3fc50e9f2730ffbbf3cf">
-        <w:r>
-          <w:rPr>
-            <w:rStyle w:val="Hyperlink"/>
-          </w:rPr>
-          <w:t xml:space="preserve">Mike Olbinski Photography, 2017</w:t>
-        </w:r>
-      </w:hyperlink>
-      <w:r>
-        <w:t xml:space="preserve">)</w:t>
+        <w:t xml:space="preserve">(Mike Olbinski Photography, 2017)</w:t>
       </w:r>
       <w:r>
         <w:t xml:space="preserve">. As you view it, pay attention to the way the types and rhythms of the images flow and work in sync with the music and sound effects especially from 2: 29 onward.</w:t>
@@ -14055,18 +13711,7 @@
         <w:t xml:space="preserve"> </w:t>
       </w:r>
       <w:r>
-        <w:t xml:space="preserve">(</w:t>
-      </w:r>
-      <w:hyperlink w:anchor="ref-filmriotCritiquingYourShort2018">
-        <w:r>
-          <w:rPr>
-            <w:rStyle w:val="Hyperlink"/>
-          </w:rPr>
-          <w:t xml:space="preserve">Film Riot, 2018</w:t>
-        </w:r>
-      </w:hyperlink>
-      <w:r>
-        <w:t xml:space="preserve">)</w:t>
+        <w:t xml:space="preserve">(Film Riot, 2018)</w:t>
       </w:r>
       <w:r>
         <w:t xml:space="preserve"> </w:t>
@@ -14537,18 +14182,7 @@
         <w:t xml:space="preserve"> </w:t>
       </w:r>
       <w:r>
-        <w:t xml:space="preserve">(</w:t>
-      </w:r>
-      <w:hyperlink w:anchor="ref-indymogul7ThingsKnow2013">
-        <w:r>
-          <w:rPr>
-            <w:rStyle w:val="Hyperlink"/>
-          </w:rPr>
-          <w:t xml:space="preserve">Mogul, 2013</w:t>
-        </w:r>
-      </w:hyperlink>
-      <w:r>
-        <w:t xml:space="preserve">)</w:t>
+        <w:t xml:space="preserve">(Mogul, 2013)</w:t>
       </w:r>
       <w:r>
         <w:t xml:space="preserve"> </w:t>
@@ -15124,46 +14758,23 @@
       <w:r>
         <w:t xml:space="preserve">(</w:t>
       </w:r>
-      <w:hyperlink w:anchor="ref-adminWhatTypeShort2012">
-        <w:r>
-          <w:rPr>
-            <w:rStyle w:val="Hyperlink"/>
-          </w:rPr>
-          <w:t xml:space="preserve">“What Type of Short Films Do We Prefer on</w:t>
-        </w:r>
-        <w:r>
-          <w:rPr>
-            <w:rStyle w:val="Hyperlink"/>
-          </w:rPr>
-          <w:t xml:space="preserve"> </w:t>
-        </w:r>
-        <w:r>
-          <w:rPr>
-            <w:rStyle w:val="Hyperlink"/>
-          </w:rPr>
-          <w:t xml:space="preserve">FilmShortage</w:t>
-        </w:r>
-        <w:r>
-          <w:rPr>
-            <w:rStyle w:val="Hyperlink"/>
-          </w:rPr>
-          <w:t xml:space="preserve">?”</w:t>
-        </w:r>
-        <w:r>
-          <w:rPr>
-            <w:rStyle w:val="Hyperlink"/>
-          </w:rPr>
-          <w:t xml:space="preserve"> </w:t>
-        </w:r>
-        <w:r>
-          <w:rPr>
-            <w:rStyle w:val="Hyperlink"/>
-          </w:rPr>
-          <w:t xml:space="preserve">2012</w:t>
-        </w:r>
-      </w:hyperlink>
-      <w:r>
-        <w:t xml:space="preserve">)</w:t>
+      <w:r>
+        <w:t xml:space="preserve">“What Type of Short Films Do We Prefer on</w:t>
+      </w:r>
+      <w:r>
+        <w:t xml:space="preserve"> </w:t>
+      </w:r>
+      <w:r>
+        <w:t xml:space="preserve">FilmShortage</w:t>
+      </w:r>
+      <w:r>
+        <w:t xml:space="preserve">?”</w:t>
+      </w:r>
+      <w:r>
+        <w:t xml:space="preserve"> </w:t>
+      </w:r>
+      <w:r>
+        <w:t xml:space="preserve">2012)</w:t>
       </w:r>
     </w:p>
     <w:p>
@@ -15470,18 +15081,7 @@
         <w:t xml:space="preserve"> </w:t>
       </w:r>
       <w:r>
-        <w:t xml:space="preserve">(</w:t>
-      </w:r>
-      <w:hyperlink w:anchor="ref-PopularShortFilm">
-        <w:r>
-          <w:rPr>
-            <w:rStyle w:val="Hyperlink"/>
-          </w:rPr>
-          <w:t xml:space="preserve">Barnes, n.d.</w:t>
-        </w:r>
-      </w:hyperlink>
-      <w:r>
-        <w:t xml:space="preserve">)</w:t>
+        <w:t xml:space="preserve">(Barnes, n.d.)</w:t>
       </w:r>
     </w:p>
     <w:p>
@@ -15516,18 +15116,7 @@
         <w:t xml:space="preserve"> </w:t>
       </w:r>
       <w:r>
-        <w:t xml:space="preserve">(</w:t>
-      </w:r>
-      <w:hyperlink w:anchor="ref-reich2WhatGenre2017">
-        <w:r>
-          <w:rPr>
-            <w:rStyle w:val="Hyperlink"/>
-          </w:rPr>
-          <w:t xml:space="preserve">Reich, 2017</w:t>
-        </w:r>
-      </w:hyperlink>
-      <w:r>
-        <w:t xml:space="preserve">)</w:t>
+        <w:t xml:space="preserve">(Reich, 2017)</w:t>
       </w:r>
     </w:p>
     <w:p>
@@ -15692,18 +15281,7 @@
         <w:t xml:space="preserve"> </w:t>
       </w:r>
       <w:r>
-        <w:t xml:space="preserve">(</w:t>
-      </w:r>
-      <w:hyperlink w:anchor="ref-tylermoweryHowWriteShort2019">
-        <w:r>
-          <w:rPr>
-            <w:rStyle w:val="Hyperlink"/>
-          </w:rPr>
-          <w:t xml:space="preserve">Mowery, 2019</w:t>
-        </w:r>
-      </w:hyperlink>
-      <w:r>
-        <w:t xml:space="preserve">)</w:t>
+        <w:t xml:space="preserve">(Mowery, 2019)</w:t>
       </w:r>
       <w:r>
         <w:t xml:space="preserve"> </w:t>
@@ -16613,18 +16191,7 @@
         <w:t xml:space="preserve"> </w:t>
       </w:r>
       <w:r>
-        <w:t xml:space="preserve">(</w:t>
-      </w:r>
-      <w:hyperlink w:anchor="ref-OutlinesTreatmentsScriptments">
-        <w:r>
-          <w:rPr>
-            <w:rStyle w:val="Hyperlink"/>
-          </w:rPr>
-          <w:t xml:space="preserve">n.d.</w:t>
-        </w:r>
-      </w:hyperlink>
-      <w:r>
-        <w:t xml:space="preserve">)</w:t>
+        <w:t xml:space="preserve">(n.d.)</w:t>
       </w:r>
       <w:r>
         <w:t xml:space="preserve">.</w:t>
@@ -17831,18 +17398,7 @@
         <w:t xml:space="preserve"> </w:t>
       </w:r>
       <w:r>
-        <w:t xml:space="preserve">(</w:t>
-      </w:r>
-      <w:hyperlink w:anchor="ref-Filmriot2011">
-        <w:r>
-          <w:rPr>
-            <w:rStyle w:val="Hyperlink"/>
-          </w:rPr>
-          <w:t xml:space="preserve">Film Riot, 2011</w:t>
-        </w:r>
-      </w:hyperlink>
-      <w:r>
-        <w:t xml:space="preserve">)</w:t>
+        <w:t xml:space="preserve">(Film Riot, 2011)</w:t>
       </w:r>
       <w:r>
         <w:t xml:space="preserve"> </w:t>
@@ -17891,18 +17447,7 @@
         <w:t xml:space="preserve"> </w:t>
       </w:r>
       <w:r>
-        <w:t xml:space="preserve">(</w:t>
-      </w:r>
-      <w:hyperlink w:anchor="ref-Studiobinder2018">
-        <w:r>
-          <w:rPr>
-            <w:rStyle w:val="Hyperlink"/>
-          </w:rPr>
-          <w:t xml:space="preserve">StudioBinder, 2018</w:t>
-        </w:r>
-      </w:hyperlink>
-      <w:r>
-        <w:t xml:space="preserve">)</w:t>
+        <w:t xml:space="preserve">(StudioBinder, 2018)</w:t>
       </w:r>
       <w:r>
         <w:t xml:space="preserve"> </w:t>
@@ -18107,18 +17652,7 @@
         <w:t xml:space="preserve"> </w:t>
       </w:r>
       <w:r>
-        <w:t xml:space="preserve">(</w:t>
-      </w:r>
-      <w:hyperlink w:anchor="ref-Thefilmmakersblog2019">
-        <w:r>
-          <w:rPr>
-            <w:rStyle w:val="Hyperlink"/>
-          </w:rPr>
-          <w:t xml:space="preserve">The Filmmaker’s Blog, 2019</w:t>
-        </w:r>
-      </w:hyperlink>
-      <w:r>
-        <w:t xml:space="preserve">)</w:t>
+        <w:t xml:space="preserve">(The Filmmaker’s Blog, 2019)</w:t>
       </w:r>
       <w:r>
         <w:t xml:space="preserve"> </w:t>
@@ -18367,18 +17901,7 @@
         <w:t xml:space="preserve"> </w:t>
       </w:r>
       <w:r>
-        <w:t xml:space="preserve">(</w:t>
-      </w:r>
-      <w:hyperlink w:anchor="ref-BTEC2014">
-        <w:r>
-          <w:rPr>
-            <w:rStyle w:val="Hyperlink"/>
-          </w:rPr>
-          <w:t xml:space="preserve">BTEC, 2014</w:t>
-        </w:r>
-      </w:hyperlink>
-      <w:r>
-        <w:t xml:space="preserve">)</w:t>
+        <w:t xml:space="preserve">(BTEC, 2014)</w:t>
       </w:r>
       <w:r>
         <w:t xml:space="preserve"> </w:t>
@@ -18431,18 +17954,7 @@
         <w:t xml:space="preserve"> </w:t>
       </w:r>
       <w:r>
-        <w:t xml:space="preserve">(</w:t>
-      </w:r>
-      <w:hyperlink w:anchor="ref-TindellMatchcuts2016">
-        <w:r>
-          <w:rPr>
-            <w:rStyle w:val="Hyperlink"/>
-          </w:rPr>
-          <w:t xml:space="preserve">Tindell, 2016</w:t>
-        </w:r>
-      </w:hyperlink>
-      <w:r>
-        <w:t xml:space="preserve">)</w:t>
+        <w:t xml:space="preserve">(Tindell, 2016)</w:t>
       </w:r>
       <w:r>
         <w:t xml:space="preserve"> </w:t>
@@ -18495,18 +18007,7 @@
         <w:t xml:space="preserve"> </w:t>
       </w:r>
       <w:r>
-        <w:t xml:space="preserve">(</w:t>
-      </w:r>
-      <w:hyperlink w:anchor="ref-Gvfstudio2013">
-        <w:r>
-          <w:rPr>
-            <w:rStyle w:val="Hyperlink"/>
-          </w:rPr>
-          <w:t xml:space="preserve">Gvfstudio, 2013</w:t>
-        </w:r>
-      </w:hyperlink>
-      <w:r>
-        <w:t xml:space="preserve">)</w:t>
+        <w:t xml:space="preserve">(Gvfstudio, 2013)</w:t>
       </w:r>
       <w:r>
         <w:t xml:space="preserve"> </w:t>
@@ -18559,18 +18060,7 @@
         <w:t xml:space="preserve"> </w:t>
       </w:r>
       <w:r>
-        <w:t xml:space="preserve">(</w:t>
-      </w:r>
-      <w:hyperlink w:anchor="ref-Killick2014">
-        <w:r>
-          <w:rPr>
-            <w:rStyle w:val="Hyperlink"/>
-          </w:rPr>
-          <w:t xml:space="preserve">Killick, 2014a</w:t>
-        </w:r>
-      </w:hyperlink>
-      <w:r>
-        <w:t xml:space="preserve">)</w:t>
+        <w:t xml:space="preserve">(Killick, 2014a)</w:t>
       </w:r>
       <w:r>
         <w:t xml:space="preserve"> </w:t>
@@ -18623,18 +18113,7 @@
         <w:t xml:space="preserve"> </w:t>
       </w:r>
       <w:r>
-        <w:t xml:space="preserve">(</w:t>
-      </w:r>
-      <w:hyperlink w:anchor="ref-Videomaker2013">
-        <w:r>
-          <w:rPr>
-            <w:rStyle w:val="Hyperlink"/>
-          </w:rPr>
-          <w:t xml:space="preserve">Videomaker, 2013</w:t>
-        </w:r>
-      </w:hyperlink>
-      <w:r>
-        <w:t xml:space="preserve">)</w:t>
+        <w:t xml:space="preserve">(Videomaker, 2013)</w:t>
       </w:r>
       <w:r>
         <w:t xml:space="preserve"> </w:t>
@@ -18687,25 +18166,16 @@
         <w:t xml:space="preserve"> </w:t>
       </w:r>
       <w:r>
-        <w:t xml:space="preserve">(</w:t>
-      </w:r>
-      <w:hyperlink w:anchor="ref-kaicreative30DegreeRule2017">
-        <w:r>
-          <w:rPr>
-            <w:rStyle w:val="Hyperlink"/>
-          </w:rPr>
-          <w:t xml:space="preserve">KaiCreative, 2017</w:t>
-        </w:r>
-      </w:hyperlink>
-      <w:r>
-        <w:t xml:space="preserve">)</w:t>
-      </w:r>
-      <w:r>
-        <w:t xml:space="preserve"> </w:t>
-      </w:r>
-      <w:r>
-        <w:t xml:space="preserve"> </w:t>
-      </w:r>
+        <w:t xml:space="preserve">(KaiCreative, 2017)</w:t>
+      </w:r>
+      <w:r>
+        <w:t xml:space="preserve"> </w:t>
+      </w:r>
+    </w:p>
+    <w:p>
+      <w:pPr>
+        <w:pStyle w:val="FirstParagraph"/>
+      </w:pPr>
       <w:hyperlink r:id="rId96">
         <w:r>
           <w:rPr>
@@ -18717,7 +18187,7 @@
     </w:p>
     <w:p>
       <w:pPr>
-        <w:pStyle w:val="FirstParagraph"/>
+        <w:pStyle w:val="BodyText"/>
       </w:pPr>
       <w:r>
         <w:t xml:space="preserve">Do you feel you have a stronger grasp of continuity and of each the techniques addressed? If not, review the videos of those parts you do not understand.</w:t>
@@ -19194,18 +18664,7 @@
         <w:t xml:space="preserve"> </w:t>
       </w:r>
       <w:r>
-        <w:t xml:space="preserve">(</w:t>
-      </w:r>
-      <w:hyperlink w:anchor="ref-jaredishamMasterArtShot2017">
-        <w:r>
-          <w:rPr>
-            <w:rStyle w:val="Hyperlink"/>
-          </w:rPr>
-          <w:t xml:space="preserve">Isham, 2017</w:t>
-        </w:r>
-      </w:hyperlink>
-      <w:r>
-        <w:t xml:space="preserve">)</w:t>
+        <w:t xml:space="preserve">(Isham, 2017)</w:t>
       </w:r>
       <w:r>
         <w:t xml:space="preserve"> </w:t>
@@ -19350,18 +18809,7 @@
         <w:t xml:space="preserve"> </w:t>
       </w:r>
       <w:r>
-        <w:t xml:space="preserve">(</w:t>
-      </w:r>
-      <w:hyperlink w:anchor="ref-thefilmlookHowCastACTOR2018">
-        <w:r>
-          <w:rPr>
-            <w:rStyle w:val="Hyperlink"/>
-          </w:rPr>
-          <w:t xml:space="preserve">The Film Look, 2018</w:t>
-        </w:r>
-      </w:hyperlink>
-      <w:r>
-        <w:t xml:space="preserve">)</w:t>
+        <w:t xml:space="preserve">(The Film Look, 2018)</w:t>
       </w:r>
       <w:r>
         <w:t xml:space="preserve"> </w:t>
@@ -19407,18 +18855,7 @@
         <w:t xml:space="preserve"> </w:t>
       </w:r>
       <w:r>
-        <w:t xml:space="preserve">(</w:t>
-      </w:r>
-      <w:hyperlink w:anchor="X3fa1cf828e5794034f6ff7b145b6e1e1404142a">
-        <w:r>
-          <w:rPr>
-            <w:rStyle w:val="Hyperlink"/>
-          </w:rPr>
-          <w:t xml:space="preserve">The Frugal Filmmaker, 2013</w:t>
-        </w:r>
-      </w:hyperlink>
-      <w:r>
-        <w:t xml:space="preserve">)</w:t>
+        <w:t xml:space="preserve">(The Frugal Filmmaker, 2013)</w:t>
       </w:r>
       <w:r>
         <w:t xml:space="preserve"> </w:t>
@@ -19475,18 +18912,7 @@
         <w:t xml:space="preserve"> </w:t>
       </w:r>
       <w:r>
-        <w:t xml:space="preserve">(</w:t>
-      </w:r>
-      <w:hyperlink w:anchor="ref-thefilmlookHowCastACTOR2018">
-        <w:r>
-          <w:rPr>
-            <w:rStyle w:val="Hyperlink"/>
-          </w:rPr>
-          <w:t xml:space="preserve">The Film Look, 2018</w:t>
-        </w:r>
-      </w:hyperlink>
-      <w:r>
-        <w:t xml:space="preserve">)</w:t>
+        <w:t xml:space="preserve">(The Film Look, 2018)</w:t>
       </w:r>
       <w:r>
         <w:t xml:space="preserve"> </w:t>
@@ -19853,18 +19279,7 @@
         <w:t xml:space="preserve"> </w:t>
       </w:r>
       <w:r>
-        <w:t xml:space="preserve">(</w:t>
-      </w:r>
-      <w:hyperlink w:anchor="ref-fandorSFXSecretsCut2018">
-        <w:r>
-          <w:rPr>
-            <w:rStyle w:val="Hyperlink"/>
-          </w:rPr>
-          <w:t xml:space="preserve">Fandor, 2018</w:t>
-        </w:r>
-      </w:hyperlink>
-      <w:r>
-        <w:t xml:space="preserve">)</w:t>
+        <w:t xml:space="preserve">(Fandor, 2018)</w:t>
       </w:r>
     </w:p>
     <w:p>
@@ -19910,18 +19325,7 @@
         <w:t xml:space="preserve"> </w:t>
       </w:r>
       <w:r>
-        <w:t xml:space="preserve">(</w:t>
-      </w:r>
-      <w:hyperlink w:anchor="ref-kylerhollandVideoEditingTips2018">
-        <w:r>
-          <w:rPr>
-            <w:rStyle w:val="Hyperlink"/>
-          </w:rPr>
-          <w:t xml:space="preserve">Holland, 2018</w:t>
-        </w:r>
-      </w:hyperlink>
-      <w:r>
-        <w:t xml:space="preserve">)</w:t>
+        <w:t xml:space="preserve">(Holland, 2018)</w:t>
       </w:r>
     </w:p>
     <w:p>
@@ -21240,18 +20644,7 @@
         <w:t xml:space="preserve"> </w:t>
       </w:r>
       <w:r>
-        <w:t xml:space="preserve">(</w:t>
-      </w:r>
-      <w:hyperlink w:anchor="ref-D4Darious">
-        <w:r>
-          <w:rPr>
-            <w:rStyle w:val="Hyperlink"/>
-          </w:rPr>
-          <w:t xml:space="preserve">D4Darious, 2017</w:t>
-        </w:r>
-      </w:hyperlink>
-      <w:r>
-        <w:t xml:space="preserve">)</w:t>
+        <w:t xml:space="preserve">(D4Darious, 2017)</w:t>
       </w:r>
     </w:p>
     <w:p>
@@ -21301,18 +20694,7 @@
         <w:t xml:space="preserve"> </w:t>
       </w:r>
       <w:r>
-        <w:t xml:space="preserve">(</w:t>
-      </w:r>
-      <w:hyperlink w:anchor="ref-Haapoja2018">
-        <w:r>
-          <w:rPr>
-            <w:rStyle w:val="Hyperlink"/>
-          </w:rPr>
-          <w:t xml:space="preserve">Haapoja, 2018</w:t>
-        </w:r>
-      </w:hyperlink>
-      <w:r>
-        <w:t xml:space="preserve">)</w:t>
+        <w:t xml:space="preserve">(Haapoja, 2018)</w:t>
       </w:r>
     </w:p>
     <w:p>
@@ -23342,11 +22724,7 @@
     </w:p>
     <w:bookmarkEnd w:id="167"/>
     <w:bookmarkEnd w:id="168"/>
-    <w:sectPr>
-      <w:footnotePr>
-        <w:numRestart w:val="eachSect"/>
-      </w:footnotePr>
-    </w:sectPr>
+    <w:sectPr/>
   </w:body>
 </w:document>
 </file>
@@ -24438,6 +23816,8 @@
     </w:pPr>
     <w:rPr>
       <w:rFonts w:asciiTheme="majorHAnsi" w:cstheme="majorBidi" w:eastAsiaTheme="majorEastAsia" w:hAnsiTheme="majorHAnsi"/>
+      <w:spacing w:val="-10"/>
+      <w:kern w:val="28"/>
       <w:sz w:val="56"/>
       <w:szCs w:val="56"/>
     </w:rPr>
@@ -24450,6 +23830,8 @@
     <w:rsid w:val="00A10FD9"/>
     <w:rPr>
       <w:rFonts w:asciiTheme="majorHAnsi" w:cstheme="majorBidi" w:eastAsiaTheme="majorEastAsia" w:hAnsiTheme="majorHAnsi"/>
+      <w:spacing w:val="-10"/>
+      <w:kern w:val="28"/>
       <w:sz w:val="56"/>
       <w:szCs w:val="56"/>
     </w:rPr>
@@ -24490,31 +23872,23 @@
   </w:style>
   <w:style w:customStyle="1" w:styleId="Author" w:type="paragraph">
     <w:name w:val="Author"/>
-    <w:basedOn w:val="Title"/>
     <w:next w:val="BodyText"/>
     <w:qFormat/>
     <w:pPr>
       <w:keepNext/>
       <w:keepLines/>
+      <w:jc w:val="center"/>
     </w:pPr>
-    <w:rPr>
-      <w:sz w:val="24"/>
-      <w:szCs w:val="24"/>
-    </w:rPr>
   </w:style>
   <w:style w:styleId="Date" w:type="paragraph">
     <w:name w:val="Date"/>
-    <w:basedOn w:val="Title"/>
     <w:next w:val="BodyText"/>
     <w:qFormat/>
     <w:pPr>
       <w:keepNext/>
       <w:keepLines/>
+      <w:jc w:val="center"/>
     </w:pPr>
-    <w:rPr>
-      <w:sz w:val="24"/>
-      <w:szCs w:val="24"/>
-    </w:rPr>
   </w:style>
   <w:style w:customStyle="1" w:styleId="AbstractTitle" w:type="paragraph">
     <w:name w:val="Abstract Title"/>

</xml_diff>